<commit_message>
Atualizar estratégia da Pousada Camburi para v2.1
Incorpora informações confirmadas pela cliente:

- Distribuição das 18 suítes em seis categorias (térreo duplo 4, térreo
  duplo com varanda 3, superior duplo 4, térreo triplo 2, superior triplo
  3, superior quádruplo 2), com leitura editorial da distribuição
- Linha do tempo societária: Rodrigo de 2002 a 2015 em imóvel arrendado;
  em 2015 Luiz, tio do Rodrigo, torna-se sócio e compra o imóvel. Vira
  seção própria da narrativa e pauta do território "A casa"
- Serviço de praia confirmado como incluso na diária, com orientação de
  como isso muda a redação
- Três pautas e três aberturas de legenda novas
- Anexo de lacunas atualizado; registra que os perfis de Instagram
  (posts de agosto/2026 e as referências) não puderam ser analisados por
  bloqueio de rede do ambiente

Co-Authored-By: Claude Opus 5 <noreply@anthropic.com>
Claude-Session: https://claude.ai/code/session_01NR3zNbNhvXwDWhP8T3nviU
</commit_message>
<xml_diff>
--- a/pousada-camburi/Estrategia-Pousada-Camburi-v2.docx
+++ b/pousada-camburi/Estrategia-Pousada-Camburi-v2.docx
@@ -52,7 +52,7 @@
           <w:sz w:val="21"/>
           <w:szCs w:val="21"/>
         </w:rPr>
-        <w:t xml:space="preserve">Versão 2.0 — setembro/2026</w:t>
+        <w:t xml:space="preserve">Versão 2.1 — setembro/2026</w:t>
       </w:r>
     </w:p>
     <w:p>
@@ -67,6 +67,22 @@
           <w:szCs w:val="21"/>
         </w:rPr>
         <w:t xml:space="preserve">Substitui integralmente o documento "Estratégia, Operações — Pousada Camburi" (v1).</w:t>
+      </w:r>
+    </w:p>
+    <w:p>
+      <w:pPr>
+        <w:spacing w:after="120" w:line="300"/>
+      </w:pPr>
+      <w:r>
+        <w:rPr>
+          <w:rFonts w:ascii="Calibri" w:cs="Calibri" w:eastAsia="Calibri" w:hAnsi="Calibri"/>
+          <w:i/>
+          <w:iCs/>
+          <w:color w:val="1A1A1A"/>
+          <w:sz w:val="21"/>
+          <w:szCs w:val="21"/>
+        </w:rPr>
+        <w:t xml:space="preserve">v2.1: distribuição das 18 suítes por categoria, linha do tempo societária (2002–2015–hoje) e confirmação de que o serviço de praia é incluso na diária.</w:t>
       </w:r>
     </w:p>
     <w:p>
@@ -1278,6 +1294,500 @@
           <w:szCs w:val="21"/>
         </w:rPr>
         <w:t xml:space="preserve">Aqui o tempo ganha outro ritmo, e a simplicidade se revela a mais pura forma de luxo. Uma tradição de acolhimento que se aprimora a cada dia, transformando estadias em memórias e na sensação de estar exatamente onde se deveria estar.</w:t>
+      </w:r>
+    </w:p>
+    <w:p>
+      <w:pPr>
+        <w:keepNext/>
+        <w:spacing w:after="160" w:before="320"/>
+      </w:pPr>
+      <w:r>
+        <w:rPr>
+          <w:rFonts w:ascii="Calibri" w:cs="Calibri" w:eastAsia="Calibri" w:hAnsi="Calibri"/>
+          <w:b/>
+          <w:bCs/>
+          <w:color w:val="0E3740"/>
+          <w:sz w:val="25"/>
+          <w:szCs w:val="25"/>
+        </w:rPr>
+        <w:t xml:space="preserve">Linha do tempo</w:t>
+      </w:r>
+    </w:p>
+    <w:tbl>
+      <w:tblPr>
+        <w:tblW w:type="dxa" w:w="9026"/>
+        <w:tblBorders>
+          <w:top w:val="single" w:color="FFFFFF" w:sz="2"/>
+          <w:left w:val="single" w:color="FFFFFF" w:sz="2"/>
+          <w:bottom w:val="single" w:color="FFFFFF" w:sz="2"/>
+          <w:right w:val="single" w:color="FFFFFF" w:sz="2"/>
+          <w:insideH w:val="single" w:color="FFFFFF" w:sz="2"/>
+          <w:insideV w:val="single" w:color="FFFFFF" w:sz="2"/>
+        </w:tblBorders>
+      </w:tblPr>
+      <w:tblGrid>
+        <w:gridCol w:w="4513"/>
+        <w:gridCol w:w="4513"/>
+      </w:tblGrid>
+      <w:tr>
+        <w:trPr>
+          <w:tblHeader/>
+        </w:trPr>
+        <w:tc>
+          <w:tcPr>
+            <w:tcW w:type="dxa" w:w="4513"/>
+            <w:shd w:fill="0E3740" w:color="auto" w:val="clear"/>
+            <w:tcMar>
+              <w:top w:type="dxa" w:w="80"/>
+              <w:left w:type="dxa" w:w="120"/>
+              <w:bottom w:type="dxa" w:w="80"/>
+              <w:right w:type="dxa" w:w="120"/>
+            </w:tcMar>
+          </w:tcPr>
+          <w:p>
+            <w:pPr>
+              <w:spacing w:after="0" w:line="260"/>
+            </w:pPr>
+            <w:r>
+              <w:rPr>
+                <w:rFonts w:ascii="Calibri" w:cs="Calibri" w:eastAsia="Calibri" w:hAnsi="Calibri"/>
+                <w:b/>
+                <w:bCs/>
+                <w:color w:val="FFFFFF"/>
+                <w:sz w:val="19"/>
+                <w:szCs w:val="19"/>
+              </w:rPr>
+              <w:t xml:space="preserve">Ano</w:t>
+            </w:r>
+          </w:p>
+        </w:tc>
+        <w:tc>
+          <w:tcPr>
+            <w:tcW w:type="dxa" w:w="4513"/>
+            <w:shd w:fill="0E3740" w:color="auto" w:val="clear"/>
+            <w:tcMar>
+              <w:top w:type="dxa" w:w="80"/>
+              <w:left w:type="dxa" w:w="120"/>
+              <w:bottom w:type="dxa" w:w="80"/>
+              <w:right w:type="dxa" w:w="120"/>
+            </w:tcMar>
+          </w:tcPr>
+          <w:p>
+            <w:pPr>
+              <w:spacing w:after="0" w:line="260"/>
+            </w:pPr>
+            <w:r>
+              <w:rPr>
+                <w:rFonts w:ascii="Calibri" w:cs="Calibri" w:eastAsia="Calibri" w:hAnsi="Calibri"/>
+                <w:b/>
+                <w:bCs/>
+                <w:color w:val="FFFFFF"/>
+                <w:sz w:val="19"/>
+                <w:szCs w:val="19"/>
+              </w:rPr>
+              <w:t xml:space="preserve">O que aconteceu</w:t>
+            </w:r>
+          </w:p>
+        </w:tc>
+      </w:tr>
+      <w:tr>
+        <w:tc>
+          <w:tcPr>
+            <w:tcW w:type="dxa" w:w="4513"/>
+            <w:shd w:fill="F2F2F2" w:color="auto" w:val="clear"/>
+            <w:tcMar>
+              <w:top w:type="dxa" w:w="80"/>
+              <w:left w:type="dxa" w:w="120"/>
+              <w:bottom w:type="dxa" w:w="80"/>
+              <w:right w:type="dxa" w:w="120"/>
+            </w:tcMar>
+          </w:tcPr>
+          <w:p>
+            <w:pPr>
+              <w:spacing w:after="0" w:line="260"/>
+            </w:pPr>
+            <w:r>
+              <w:rPr>
+                <w:rFonts w:ascii="Calibri" w:cs="Calibri" w:eastAsia="Calibri" w:hAnsi="Calibri"/>
+                <w:b/>
+                <w:bCs/>
+                <w:color w:val="0E3740"/>
+                <w:sz w:val="19"/>
+                <w:szCs w:val="19"/>
+              </w:rPr>
+              <w:t xml:space="preserve">2002</w:t>
+            </w:r>
+          </w:p>
+        </w:tc>
+        <w:tc>
+          <w:tcPr>
+            <w:tcW w:type="dxa" w:w="4513"/>
+            <w:shd w:fill="F2F2F2" w:color="auto" w:val="clear"/>
+            <w:tcMar>
+              <w:top w:type="dxa" w:w="80"/>
+              <w:left w:type="dxa" w:w="120"/>
+              <w:bottom w:type="dxa" w:w="80"/>
+              <w:right w:type="dxa" w:w="120"/>
+            </w:tcMar>
+          </w:tcPr>
+          <w:p>
+            <w:pPr>
+              <w:spacing w:after="0" w:line="260"/>
+            </w:pPr>
+            <w:r>
+              <w:rPr>
+                <w:rFonts w:ascii="Calibri" w:cs="Calibri" w:eastAsia="Calibri" w:hAnsi="Calibri"/>
+                <w:b w:val="false"/>
+                <w:bCs w:val="false"/>
+                <w:color w:val="1A1A1A"/>
+                <w:sz w:val="19"/>
+                <w:szCs w:val="19"/>
+              </w:rPr>
+              <w:t xml:space="preserve">Rodrigo abre a Pousada Camburi. O imóvel é </w:t>
+            </w:r>
+            <w:r>
+              <w:rPr>
+                <w:rFonts w:ascii="Calibri" w:cs="Calibri" w:eastAsia="Calibri" w:hAnsi="Calibri"/>
+                <w:b/>
+                <w:bCs/>
+                <w:color w:val="0E3740"/>
+                <w:sz w:val="19"/>
+                <w:szCs w:val="19"/>
+              </w:rPr>
+              <w:t xml:space="preserve">arrendado</w:t>
+            </w:r>
+            <w:r>
+              <w:rPr>
+                <w:rFonts w:ascii="Calibri" w:cs="Calibri" w:eastAsia="Calibri" w:hAnsi="Calibri"/>
+                <w:b w:val="false"/>
+                <w:bCs w:val="false"/>
+                <w:color w:val="1A1A1A"/>
+                <w:sz w:val="19"/>
+                <w:szCs w:val="19"/>
+              </w:rPr>
+              <w:t xml:space="preserve">.</w:t>
+            </w:r>
+          </w:p>
+        </w:tc>
+      </w:tr>
+      <w:tr>
+        <w:tc>
+          <w:tcPr>
+            <w:tcW w:type="dxa" w:w="4513"/>
+            <w:shd w:fill="F2F2F2" w:color="auto" w:val="clear"/>
+            <w:tcMar>
+              <w:top w:type="dxa" w:w="80"/>
+              <w:left w:type="dxa" w:w="120"/>
+              <w:bottom w:type="dxa" w:w="80"/>
+              <w:right w:type="dxa" w:w="120"/>
+            </w:tcMar>
+          </w:tcPr>
+          <w:p>
+            <w:pPr>
+              <w:spacing w:after="0" w:line="260"/>
+            </w:pPr>
+            <w:r>
+              <w:rPr>
+                <w:rFonts w:ascii="Calibri" w:cs="Calibri" w:eastAsia="Calibri" w:hAnsi="Calibri"/>
+                <w:b/>
+                <w:bCs/>
+                <w:color w:val="0E3740"/>
+                <w:sz w:val="19"/>
+                <w:szCs w:val="19"/>
+              </w:rPr>
+              <w:t xml:space="preserve">2002–2015</w:t>
+            </w:r>
+          </w:p>
+        </w:tc>
+        <w:tc>
+          <w:tcPr>
+            <w:tcW w:type="dxa" w:w="4513"/>
+            <w:shd w:fill="F2F2F2" w:color="auto" w:val="clear"/>
+            <w:tcMar>
+              <w:top w:type="dxa" w:w="80"/>
+              <w:left w:type="dxa" w:w="120"/>
+              <w:bottom w:type="dxa" w:w="80"/>
+              <w:right w:type="dxa" w:w="120"/>
+            </w:tcMar>
+          </w:tcPr>
+          <w:p>
+            <w:pPr>
+              <w:spacing w:after="0" w:line="260"/>
+            </w:pPr>
+            <w:r>
+              <w:rPr>
+                <w:rFonts w:ascii="Calibri" w:cs="Calibri" w:eastAsia="Calibri" w:hAnsi="Calibri"/>
+                <w:b w:val="false"/>
+                <w:bCs w:val="false"/>
+                <w:color w:val="1A1A1A"/>
+                <w:sz w:val="19"/>
+                <w:szCs w:val="19"/>
+              </w:rPr>
+              <w:t xml:space="preserve">Treze anos de operação numa casa que ainda não era da família.</w:t>
+            </w:r>
+          </w:p>
+        </w:tc>
+      </w:tr>
+      <w:tr>
+        <w:tc>
+          <w:tcPr>
+            <w:tcW w:type="dxa" w:w="4513"/>
+            <w:shd w:fill="F2F2F2" w:color="auto" w:val="clear"/>
+            <w:tcMar>
+              <w:top w:type="dxa" w:w="80"/>
+              <w:left w:type="dxa" w:w="120"/>
+              <w:bottom w:type="dxa" w:w="80"/>
+              <w:right w:type="dxa" w:w="120"/>
+            </w:tcMar>
+          </w:tcPr>
+          <w:p>
+            <w:pPr>
+              <w:spacing w:after="0" w:line="260"/>
+            </w:pPr>
+            <w:r>
+              <w:rPr>
+                <w:rFonts w:ascii="Calibri" w:cs="Calibri" w:eastAsia="Calibri" w:hAnsi="Calibri"/>
+                <w:b/>
+                <w:bCs/>
+                <w:color w:val="0E3740"/>
+                <w:sz w:val="19"/>
+                <w:szCs w:val="19"/>
+              </w:rPr>
+              <w:t xml:space="preserve">2015</w:t>
+            </w:r>
+          </w:p>
+        </w:tc>
+        <w:tc>
+          <w:tcPr>
+            <w:tcW w:type="dxa" w:w="4513"/>
+            <w:shd w:fill="F2F2F2" w:color="auto" w:val="clear"/>
+            <w:tcMar>
+              <w:top w:type="dxa" w:w="80"/>
+              <w:left w:type="dxa" w:w="120"/>
+              <w:bottom w:type="dxa" w:w="80"/>
+              <w:right w:type="dxa" w:w="120"/>
+            </w:tcMar>
+          </w:tcPr>
+          <w:p>
+            <w:pPr>
+              <w:spacing w:after="0" w:line="260"/>
+            </w:pPr>
+            <w:r>
+              <w:rPr>
+                <w:rFonts w:ascii="Calibri" w:cs="Calibri" w:eastAsia="Calibri" w:hAnsi="Calibri"/>
+                <w:b/>
+                <w:bCs/>
+                <w:color w:val="0E3740"/>
+                <w:sz w:val="19"/>
+                <w:szCs w:val="19"/>
+              </w:rPr>
+              <w:t xml:space="preserve">Luiz, tio do Rodrigo, torna-se sócio e compra o imóvel.</w:t>
+            </w:r>
+            <w:r>
+              <w:rPr>
+                <w:rFonts w:ascii="Calibri" w:cs="Calibri" w:eastAsia="Calibri" w:hAnsi="Calibri"/>
+                <w:b w:val="false"/>
+                <w:bCs w:val="false"/>
+                <w:color w:val="1A1A1A"/>
+                <w:sz w:val="19"/>
+                <w:szCs w:val="19"/>
+              </w:rPr>
+              <w:t xml:space="preserve"> A pousada deixa de ser arrendada.</w:t>
+            </w:r>
+          </w:p>
+        </w:tc>
+      </w:tr>
+      <w:tr>
+        <w:tc>
+          <w:tcPr>
+            <w:tcW w:type="dxa" w:w="4513"/>
+            <w:shd w:fill="F2F2F2" w:color="auto" w:val="clear"/>
+            <w:tcMar>
+              <w:top w:type="dxa" w:w="80"/>
+              <w:left w:type="dxa" w:w="120"/>
+              <w:bottom w:type="dxa" w:w="80"/>
+              <w:right w:type="dxa" w:w="120"/>
+            </w:tcMar>
+          </w:tcPr>
+          <w:p>
+            <w:pPr>
+              <w:spacing w:after="0" w:line="260"/>
+            </w:pPr>
+            <w:r>
+              <w:rPr>
+                <w:rFonts w:ascii="Calibri" w:cs="Calibri" w:eastAsia="Calibri" w:hAnsi="Calibri"/>
+                <w:b/>
+                <w:bCs/>
+                <w:color w:val="0E3740"/>
+                <w:sz w:val="19"/>
+                <w:szCs w:val="19"/>
+              </w:rPr>
+              <w:t xml:space="preserve">2026</w:t>
+            </w:r>
+          </w:p>
+        </w:tc>
+        <w:tc>
+          <w:tcPr>
+            <w:tcW w:type="dxa" w:w="4513"/>
+            <w:shd w:fill="F2F2F2" w:color="auto" w:val="clear"/>
+            <w:tcMar>
+              <w:top w:type="dxa" w:w="80"/>
+              <w:left w:type="dxa" w:w="120"/>
+              <w:bottom w:type="dxa" w:w="80"/>
+              <w:right w:type="dxa" w:w="120"/>
+            </w:tcMar>
+          </w:tcPr>
+          <w:p>
+            <w:pPr>
+              <w:spacing w:after="0" w:line="260"/>
+            </w:pPr>
+            <w:r>
+              <w:rPr>
+                <w:rFonts w:ascii="Calibri" w:cs="Calibri" w:eastAsia="Calibri" w:hAnsi="Calibri"/>
+                <w:b w:val="false"/>
+                <w:bCs w:val="false"/>
+                <w:color w:val="1A1A1A"/>
+                <w:sz w:val="19"/>
+                <w:szCs w:val="19"/>
+              </w:rPr>
+              <w:t xml:space="preserve">24 anos. Aniversário em 22/08.</w:t>
+            </w:r>
+          </w:p>
+        </w:tc>
+      </w:tr>
+    </w:tbl>
+    <w:p>
+      <w:pPr>
+        <w:spacing w:after="200"/>
+      </w:pPr>
+      <w:r>
+        <w:t xml:space="preserve"/>
+      </w:r>
+    </w:p>
+    <w:p>
+      <w:pPr>
+        <w:keepNext/>
+        <w:spacing w:after="160" w:before="320"/>
+      </w:pPr>
+      <w:r>
+        <w:rPr>
+          <w:rFonts w:ascii="Calibri" w:cs="Calibri" w:eastAsia="Calibri" w:hAnsi="Calibri"/>
+          <w:b/>
+          <w:bCs/>
+          <w:color w:val="0E3740"/>
+          <w:sz w:val="25"/>
+          <w:szCs w:val="25"/>
+        </w:rPr>
+        <w:t xml:space="preserve">O capítulo de 2015 — a melhor história que a marca ainda não contou</w:t>
+      </w:r>
+    </w:p>
+    <w:p>
+      <w:pPr>
+        <w:spacing w:after="120" w:line="300"/>
+      </w:pPr>
+      <w:r>
+        <w:rPr>
+          <w:rFonts w:ascii="Calibri" w:cs="Calibri" w:eastAsia="Calibri" w:hAnsi="Calibri"/>
+          <w:color w:val="1A1A1A"/>
+          <w:sz w:val="21"/>
+          <w:szCs w:val="21"/>
+        </w:rPr>
+        <w:t xml:space="preserve">Durante treze anos, a Pousada Camburi funcionou numa casa que não era da família. Cada geleia feita, cada temporada aberta, cada hóspede que voltou — tudo isso aconteceu em cima de um contrato que podia acabar.</w:t>
+      </w:r>
+    </w:p>
+    <w:p>
+      <w:pPr>
+        <w:spacing w:after="120" w:line="300"/>
+      </w:pPr>
+      <w:r>
+        <w:rPr>
+          <w:rFonts w:ascii="Calibri" w:cs="Calibri" w:eastAsia="Calibri" w:hAnsi="Calibri"/>
+          <w:color w:val="1A1A1A"/>
+          <w:sz w:val="21"/>
+          <w:szCs w:val="21"/>
+        </w:rPr>
+        <w:t xml:space="preserve">Em 2015, Luiz, tio do Rodrigo, entrou como sócio e comprou o imóvel.</w:t>
+      </w:r>
+    </w:p>
+    <w:p>
+      <w:pPr>
+        <w:spacing w:after="120" w:line="300"/>
+      </w:pPr>
+      <w:r>
+        <w:rPr>
+          <w:rFonts w:ascii="Calibri" w:cs="Calibri" w:eastAsia="Calibri" w:hAnsi="Calibri"/>
+          <w:color w:val="1A1A1A"/>
+          <w:sz w:val="21"/>
+          <w:szCs w:val="21"/>
+        </w:rPr>
+        <w:t xml:space="preserve">Isso não é informação societária. É a prova de constância que a marca precisa: </w:t>
+      </w:r>
+      <w:r>
+        <w:rPr>
+          <w:rFonts w:ascii="Calibri" w:cs="Calibri" w:eastAsia="Calibri" w:hAnsi="Calibri"/>
+          <w:b/>
+          <w:bCs/>
+          <w:color w:val="1A1A1A"/>
+          <w:sz w:val="21"/>
+          <w:szCs w:val="21"/>
+        </w:rPr>
+        <w:t xml:space="preserve">treze anos cuidando de uma casa antes de ela ser sua.</w:t>
+      </w:r>
+      <w:r>
+        <w:rPr>
+          <w:rFonts w:ascii="Calibri" w:cs="Calibri" w:eastAsia="Calibri" w:hAnsi="Calibri"/>
+          <w:color w:val="1A1A1A"/>
+          <w:sz w:val="21"/>
+          <w:szCs w:val="21"/>
+        </w:rPr>
+        <w:t xml:space="preserve"> Ninguém investe assim em algo de passagem. É o momento em que a pousada decidiu ficar.</w:t>
+      </w:r>
+    </w:p>
+    <w:p>
+      <w:pPr>
+        <w:spacing w:after="120" w:line="300"/>
+      </w:pPr>
+      <w:r>
+        <w:rPr>
+          <w:rFonts w:ascii="Calibri" w:cs="Calibri" w:eastAsia="Calibri" w:hAnsi="Calibri"/>
+          <w:color w:val="1A1A1A"/>
+          <w:sz w:val="21"/>
+          <w:szCs w:val="21"/>
+        </w:rPr>
+        <w:t xml:space="preserve">E conversa diretamente com o conceito-âncora: o hóspede que chegou em 2010 nunca soube que a casa era alugada. Ele só viu o café pronto. Mais um esforço que desapareceu antes de ele acordar.</w:t>
+      </w:r>
+    </w:p>
+    <w:p>
+      <w:pPr>
+        <w:pBdr>
+          <w:left w:val="single" w:color="04B2D9" w:sz="18" w:space="14"/>
+        </w:pBdr>
+        <w:spacing w:after="200" w:before="160" w:line="320"/>
+        <w:ind w:left="460"/>
+      </w:pPr>
+      <w:r>
+        <w:rPr>
+          <w:rFonts w:ascii="Calibri" w:cs="Calibri" w:eastAsia="Calibri" w:hAnsi="Calibri"/>
+          <w:b/>
+          <w:bCs/>
+          <w:i w:val="false"/>
+          <w:iCs w:val="false"/>
+          <w:color w:val="0E3740"/>
+          <w:sz w:val="22"/>
+          <w:szCs w:val="22"/>
+        </w:rPr>
+        <w:t xml:space="preserve">Sugestão de uso:</w:t>
+      </w:r>
+      <w:r>
+        <w:rPr>
+          <w:rFonts w:ascii="Calibri" w:cs="Calibri" w:eastAsia="Calibri" w:hAnsi="Calibri"/>
+          <w:i w:val="false"/>
+          <w:iCs w:val="false"/>
+          <w:color w:val="2C3E44"/>
+          <w:sz w:val="22"/>
+          <w:szCs w:val="22"/>
+        </w:rPr>
+        <w:t xml:space="preserve"> este é o conteúdo do aniversário — de 2027 em diante, e sempre que a pauta pedir profundidade. Não é post de agosto, é post de marca. Formato ideal: carrossel com foto antiga + foto de hoje, legenda na Fórmula 1 (O Bastidor).</w:t>
       </w:r>
     </w:p>
     <w:p>
@@ -4879,12 +5389,7 @@
     </w:p>
     <w:p>
       <w:pPr>
-        <w:pStyle w:val="ListParagraph"/>
-        <w:numPr>
-          <w:ilvl w:val="0"/>
-          <w:numId w:val="2"/>
-        </w:numPr>
-        <w:spacing w:after="60" w:line="290"/>
+        <w:spacing w:after="120" w:line="300"/>
       </w:pPr>
       <w:r>
         <w:rPr>
@@ -4904,1012 +5409,7 @@
           <w:sz w:val="21"/>
           <w:szCs w:val="21"/>
         </w:rPr>
-        <w:t xml:space="preserve">, nas categorias </w:t>
-      </w:r>
-      <w:r>
-        <w:rPr>
-          <w:rFonts w:ascii="Calibri" w:cs="Calibri" w:eastAsia="Calibri" w:hAnsi="Calibri"/>
-          <w:b/>
-          <w:bCs/>
-          <w:color w:val="1A1A1A"/>
-          <w:sz w:val="21"/>
-          <w:szCs w:val="21"/>
-        </w:rPr>
-        <w:t xml:space="preserve">duplo, triplo e quádruplo</w:t>
-      </w:r>
-      <w:r>
-        <w:rPr>
-          <w:rFonts w:ascii="Calibri" w:cs="Calibri" w:eastAsia="Calibri" w:hAnsi="Calibri"/>
-          <w:color w:val="1A1A1A"/>
-          <w:sz w:val="21"/>
-          <w:szCs w:val="21"/>
-        </w:rPr>
-        <w:t xml:space="preserve">.</w:t>
-      </w:r>
-    </w:p>
-    <w:p>
-      <w:pPr>
-        <w:pStyle w:val="ListParagraph"/>
-        <w:numPr>
-          <w:ilvl w:val="0"/>
-          <w:numId w:val="2"/>
-        </w:numPr>
-        <w:spacing w:after="60" w:line="290"/>
-      </w:pPr>
-      <w:r>
-        <w:rPr>
-          <w:rFonts w:ascii="Calibri" w:cs="Calibri" w:eastAsia="Calibri" w:hAnsi="Calibri"/>
-          <w:color w:val="1A1A1A"/>
-          <w:sz w:val="21"/>
-          <w:szCs w:val="21"/>
-        </w:rPr>
-        <w:t xml:space="preserve">A escala é argumento de marca: 18 suítes significam que dá para saber o nome de quem chega.</w:t>
-      </w:r>
-    </w:p>
-    <w:p>
-      <w:pPr>
-        <w:keepNext/>
-        <w:spacing w:after="200" w:before="360"/>
-      </w:pPr>
-      <w:r>
-        <w:rPr>
-          <w:rFonts w:ascii="Calibri" w:cs="Calibri" w:eastAsia="Calibri" w:hAnsi="Calibri"/>
-          <w:b/>
-          <w:bCs/>
-          <w:color w:val="049DD9"/>
-          <w:sz w:val="30"/>
-          <w:szCs w:val="30"/>
-        </w:rPr>
-        <w:t xml:space="preserve">2.2 CAFÉ DA MANHÃ</w:t>
-      </w:r>
-    </w:p>
-    <w:p>
-      <w:pPr>
-        <w:pStyle w:val="ListParagraph"/>
-        <w:numPr>
-          <w:ilvl w:val="0"/>
-          <w:numId w:val="2"/>
-        </w:numPr>
-        <w:spacing w:after="60" w:line="290"/>
-      </w:pPr>
-      <w:r>
-        <w:rPr>
-          <w:rFonts w:ascii="Calibri" w:cs="Calibri" w:eastAsia="Calibri" w:hAnsi="Calibri"/>
-          <w:b/>
-          <w:bCs/>
-          <w:color w:val="1A1A1A"/>
-          <w:sz w:val="21"/>
-          <w:szCs w:val="21"/>
-        </w:rPr>
-        <w:t xml:space="preserve">Buffet continental</w:t>
-      </w:r>
-      <w:r>
-        <w:rPr>
-          <w:rFonts w:ascii="Calibri" w:cs="Calibri" w:eastAsia="Calibri" w:hAnsi="Calibri"/>
-          <w:color w:val="1A1A1A"/>
-          <w:sz w:val="21"/>
-          <w:szCs w:val="21"/>
-        </w:rPr>
-        <w:t xml:space="preserve">, com dois preparos feitos na hora, sob pedido:</w:t>
-      </w:r>
-    </w:p>
-    <w:p>
-      <w:pPr>
-        <w:pStyle w:val="ListParagraph"/>
-        <w:numPr>
-          <w:ilvl w:val="1"/>
-          <w:numId w:val="2"/>
-        </w:numPr>
-        <w:spacing w:after="60" w:line="290"/>
-      </w:pPr>
-      <w:r>
-        <w:rPr>
-          <w:rFonts w:ascii="Calibri" w:cs="Calibri" w:eastAsia="Calibri" w:hAnsi="Calibri"/>
-          <w:b/>
-          <w:bCs/>
-          <w:color w:val="1A1A1A"/>
-          <w:sz w:val="21"/>
-          <w:szCs w:val="21"/>
-        </w:rPr>
-        <w:t xml:space="preserve">Ovos</w:t>
-      </w:r>
-      <w:r>
-        <w:rPr>
-          <w:rFonts w:ascii="Calibri" w:cs="Calibri" w:eastAsia="Calibri" w:hAnsi="Calibri"/>
-          <w:color w:val="1A1A1A"/>
-          <w:sz w:val="21"/>
-          <w:szCs w:val="21"/>
-        </w:rPr>
-        <w:t xml:space="preserve"> — do jeito que cada um gosta</w:t>
-      </w:r>
-    </w:p>
-    <w:p>
-      <w:pPr>
-        <w:pStyle w:val="ListParagraph"/>
-        <w:numPr>
-          <w:ilvl w:val="1"/>
-          <w:numId w:val="2"/>
-        </w:numPr>
-        <w:spacing w:after="60" w:line="290"/>
-      </w:pPr>
-      <w:r>
-        <w:rPr>
-          <w:rFonts w:ascii="Calibri" w:cs="Calibri" w:eastAsia="Calibri" w:hAnsi="Calibri"/>
-          <w:b/>
-          <w:bCs/>
-          <w:color w:val="1A1A1A"/>
-          <w:sz w:val="21"/>
-          <w:szCs w:val="21"/>
-        </w:rPr>
-        <w:t xml:space="preserve">Tapioca</w:t>
-      </w:r>
-    </w:p>
-    <w:p>
-      <w:pPr>
-        <w:pStyle w:val="ListParagraph"/>
-        <w:numPr>
-          <w:ilvl w:val="0"/>
-          <w:numId w:val="2"/>
-        </w:numPr>
-        <w:spacing w:after="60" w:line="290"/>
-      </w:pPr>
-      <w:r>
-        <w:rPr>
-          <w:rFonts w:ascii="Calibri" w:cs="Calibri" w:eastAsia="Calibri" w:hAnsi="Calibri"/>
-          <w:b/>
-          <w:bCs/>
-          <w:color w:val="1A1A1A"/>
-          <w:sz w:val="21"/>
-          <w:szCs w:val="21"/>
-        </w:rPr>
-        <w:t xml:space="preserve">Geleia artesanal</w:t>
-      </w:r>
-      <w:r>
-        <w:rPr>
-          <w:rFonts w:ascii="Calibri" w:cs="Calibri" w:eastAsia="Calibri" w:hAnsi="Calibri"/>
-          <w:color w:val="1A1A1A"/>
-          <w:sz w:val="21"/>
-          <w:szCs w:val="21"/>
-        </w:rPr>
-        <w:t xml:space="preserve"> e </w:t>
-      </w:r>
-      <w:r>
-        <w:rPr>
-          <w:rFonts w:ascii="Calibri" w:cs="Calibri" w:eastAsia="Calibri" w:hAnsi="Calibri"/>
-          <w:b/>
-          <w:bCs/>
-          <w:color w:val="1A1A1A"/>
-          <w:sz w:val="21"/>
-          <w:szCs w:val="21"/>
-        </w:rPr>
-        <w:t xml:space="preserve">coalhada artesanal</w:t>
-      </w:r>
-      <w:r>
-        <w:rPr>
-          <w:rFonts w:ascii="Calibri" w:cs="Calibri" w:eastAsia="Calibri" w:hAnsi="Calibri"/>
-          <w:color w:val="1A1A1A"/>
-          <w:sz w:val="21"/>
-          <w:szCs w:val="21"/>
-        </w:rPr>
-        <w:t xml:space="preserve"> — produção própria.</w:t>
-      </w:r>
-    </w:p>
-    <w:p>
-      <w:pPr>
-        <w:pStyle w:val="ListParagraph"/>
-        <w:numPr>
-          <w:ilvl w:val="0"/>
-          <w:numId w:val="2"/>
-        </w:numPr>
-        <w:spacing w:after="60" w:line="290"/>
-      </w:pPr>
-      <w:r>
-        <w:rPr>
-          <w:rFonts w:ascii="Calibri" w:cs="Calibri" w:eastAsia="Calibri" w:hAnsi="Calibri"/>
-          <w:color w:val="1A1A1A"/>
-          <w:sz w:val="21"/>
-          <w:szCs w:val="21"/>
-        </w:rPr>
-        <w:t xml:space="preserve">É o serviço mais citado nas avaliações. É o principal ativo de conteúdo da pousada.</w:t>
-      </w:r>
-    </w:p>
-    <w:p>
-      <w:pPr>
-        <w:keepNext/>
-        <w:spacing w:after="200" w:before="360"/>
-      </w:pPr>
-      <w:r>
-        <w:rPr>
-          <w:rFonts w:ascii="Calibri" w:cs="Calibri" w:eastAsia="Calibri" w:hAnsi="Calibri"/>
-          <w:b/>
-          <w:bCs/>
-          <w:color w:val="049DD9"/>
-          <w:sz w:val="30"/>
-          <w:szCs w:val="30"/>
-        </w:rPr>
-        <w:t xml:space="preserve">2.3 RESTAURANTE, BAR E ADEGA</w:t>
-      </w:r>
-    </w:p>
-    <w:p>
-      <w:pPr>
-        <w:pStyle w:val="ListParagraph"/>
-        <w:numPr>
-          <w:ilvl w:val="0"/>
-          <w:numId w:val="2"/>
-        </w:numPr>
-        <w:spacing w:after="60" w:line="290"/>
-      </w:pPr>
-      <w:r>
-        <w:rPr>
-          <w:rFonts w:ascii="Calibri" w:cs="Calibri" w:eastAsia="Calibri" w:hAnsi="Calibri"/>
-          <w:b/>
-          <w:bCs/>
-          <w:color w:val="1A1A1A"/>
-          <w:sz w:val="21"/>
-          <w:szCs w:val="21"/>
-        </w:rPr>
-        <w:t xml:space="preserve">Restaurante próprio</w:t>
-      </w:r>
-      <w:r>
-        <w:rPr>
-          <w:rFonts w:ascii="Calibri" w:cs="Calibri" w:eastAsia="Calibri" w:hAnsi="Calibri"/>
-          <w:color w:val="1A1A1A"/>
-          <w:sz w:val="21"/>
-          <w:szCs w:val="21"/>
-        </w:rPr>
-        <w:t xml:space="preserve"> para almoço.</w:t>
-      </w:r>
-    </w:p>
-    <w:p>
-      <w:pPr>
-        <w:pStyle w:val="ListParagraph"/>
-        <w:numPr>
-          <w:ilvl w:val="0"/>
-          <w:numId w:val="2"/>
-        </w:numPr>
-        <w:spacing w:after="60" w:line="290"/>
-      </w:pPr>
-      <w:r>
-        <w:rPr>
-          <w:rFonts w:ascii="Calibri" w:cs="Calibri" w:eastAsia="Calibri" w:hAnsi="Calibri"/>
-          <w:b/>
-          <w:bCs/>
-          <w:color w:val="1A1A1A"/>
-          <w:sz w:val="21"/>
-          <w:szCs w:val="21"/>
-        </w:rPr>
-        <w:t xml:space="preserve">Porções servidas na praia</w:t>
-      </w:r>
-      <w:r>
-        <w:rPr>
-          <w:rFonts w:ascii="Calibri" w:cs="Calibri" w:eastAsia="Calibri" w:hAnsi="Calibri"/>
-          <w:color w:val="1A1A1A"/>
-          <w:sz w:val="21"/>
-          <w:szCs w:val="21"/>
-        </w:rPr>
-        <w:t xml:space="preserve"> — </w:t>
-      </w:r>
-      <w:r>
-        <w:rPr>
-          <w:rFonts w:ascii="Calibri" w:cs="Calibri" w:eastAsia="Calibri" w:hAnsi="Calibri"/>
-          <w:b/>
-          <w:bCs/>
-          <w:color w:val="1A1A1A"/>
-          <w:sz w:val="21"/>
-          <w:szCs w:val="21"/>
-        </w:rPr>
-        <w:t xml:space="preserve">sem taxa de serviço</w:t>
-      </w:r>
-      <w:r>
-        <w:rPr>
-          <w:rFonts w:ascii="Calibri" w:cs="Calibri" w:eastAsia="Calibri" w:hAnsi="Calibri"/>
-          <w:color w:val="1A1A1A"/>
-          <w:sz w:val="21"/>
-          <w:szCs w:val="21"/>
-        </w:rPr>
-        <w:t xml:space="preserve">.</w:t>
-      </w:r>
-    </w:p>
-    <w:p>
-      <w:pPr>
-        <w:pStyle w:val="ListParagraph"/>
-        <w:numPr>
-          <w:ilvl w:val="0"/>
-          <w:numId w:val="2"/>
-        </w:numPr>
-        <w:spacing w:after="60" w:line="290"/>
-      </w:pPr>
-      <w:r>
-        <w:rPr>
-          <w:rFonts w:ascii="Calibri" w:cs="Calibri" w:eastAsia="Calibri" w:hAnsi="Calibri"/>
-          <w:b/>
-          <w:bCs/>
-          <w:color w:val="1A1A1A"/>
-          <w:sz w:val="21"/>
-          <w:szCs w:val="21"/>
-        </w:rPr>
-        <w:t xml:space="preserve">Bar</w:t>
-      </w:r>
-      <w:r>
-        <w:rPr>
-          <w:rFonts w:ascii="Calibri" w:cs="Calibri" w:eastAsia="Calibri" w:hAnsi="Calibri"/>
-          <w:color w:val="1A1A1A"/>
-          <w:sz w:val="21"/>
-          <w:szCs w:val="21"/>
-        </w:rPr>
-        <w:t xml:space="preserve"> para bebidas e drinks.</w:t>
-      </w:r>
-    </w:p>
-    <w:p>
-      <w:pPr>
-        <w:pStyle w:val="ListParagraph"/>
-        <w:numPr>
-          <w:ilvl w:val="0"/>
-          <w:numId w:val="2"/>
-        </w:numPr>
-        <w:spacing w:after="60" w:line="290"/>
-      </w:pPr>
-      <w:r>
-        <w:rPr>
-          <w:rFonts w:ascii="Calibri" w:cs="Calibri" w:eastAsia="Calibri" w:hAnsi="Calibri"/>
-          <w:b/>
-          <w:bCs/>
-          <w:color w:val="1A1A1A"/>
-          <w:sz w:val="21"/>
-          <w:szCs w:val="21"/>
-        </w:rPr>
-        <w:t xml:space="preserve">Adega de vinhos Luiz Argenta</w:t>
-      </w:r>
-      <w:r>
-        <w:rPr>
-          <w:rFonts w:ascii="Calibri" w:cs="Calibri" w:eastAsia="Calibri" w:hAnsi="Calibri"/>
-          <w:color w:val="1A1A1A"/>
-          <w:sz w:val="21"/>
-          <w:szCs w:val="21"/>
-        </w:rPr>
-        <w:t xml:space="preserve">.</w:t>
-      </w:r>
-    </w:p>
-    <w:p>
-      <w:pPr>
-        <w:keepNext/>
-        <w:spacing w:after="200" w:before="360"/>
-      </w:pPr>
-      <w:r>
-        <w:rPr>
-          <w:rFonts w:ascii="Calibri" w:cs="Calibri" w:eastAsia="Calibri" w:hAnsi="Calibri"/>
-          <w:b/>
-          <w:bCs/>
-          <w:color w:val="049DD9"/>
-          <w:sz w:val="30"/>
-          <w:szCs w:val="30"/>
-        </w:rPr>
-        <w:t xml:space="preserve">2.4 SERVIÇO DE PRAIA</w:t>
-      </w:r>
-    </w:p>
-    <w:p>
-      <w:pPr>
-        <w:spacing w:after="120" w:line="300"/>
-      </w:pPr>
-      <w:r>
-        <w:rPr>
-          <w:rFonts w:ascii="Calibri" w:cs="Calibri" w:eastAsia="Calibri" w:hAnsi="Calibri"/>
-          <w:color w:val="1A1A1A"/>
-          <w:sz w:val="21"/>
-          <w:szCs w:val="21"/>
-        </w:rPr>
-        <w:t xml:space="preserve">Montado </w:t>
-      </w:r>
-      <w:r>
-        <w:rPr>
-          <w:rFonts w:ascii="Calibri" w:cs="Calibri" w:eastAsia="Calibri" w:hAnsi="Calibri"/>
-          <w:b/>
-          <w:bCs/>
-          <w:color w:val="1A1A1A"/>
-          <w:sz w:val="21"/>
-          <w:szCs w:val="21"/>
-        </w:rPr>
-        <w:t xml:space="preserve">todas as manhãs</w:t>
-      </w:r>
-      <w:r>
-        <w:rPr>
-          <w:rFonts w:ascii="Calibri" w:cs="Calibri" w:eastAsia="Calibri" w:hAnsi="Calibri"/>
-          <w:color w:val="1A1A1A"/>
-          <w:sz w:val="21"/>
-          <w:szCs w:val="21"/>
-        </w:rPr>
-        <w:t xml:space="preserve">, e composto por:</w:t>
-      </w:r>
-    </w:p>
-    <w:p>
-      <w:pPr>
-        <w:pStyle w:val="ListParagraph"/>
-        <w:numPr>
-          <w:ilvl w:val="0"/>
-          <w:numId w:val="2"/>
-        </w:numPr>
-        <w:spacing w:after="60" w:line="290"/>
-      </w:pPr>
-      <w:r>
-        <w:rPr>
-          <w:rFonts w:ascii="Calibri" w:cs="Calibri" w:eastAsia="Calibri" w:hAnsi="Calibri"/>
-          <w:b/>
-          <w:bCs/>
-          <w:color w:val="1A1A1A"/>
-          <w:sz w:val="21"/>
-          <w:szCs w:val="21"/>
-        </w:rPr>
-        <w:t xml:space="preserve">Ombrelone de 2,50m</w:t>
-      </w:r>
-    </w:p>
-    <w:p>
-      <w:pPr>
-        <w:pStyle w:val="ListParagraph"/>
-        <w:numPr>
-          <w:ilvl w:val="0"/>
-          <w:numId w:val="2"/>
-        </w:numPr>
-        <w:spacing w:after="60" w:line="290"/>
-      </w:pPr>
-      <w:r>
-        <w:rPr>
-          <w:rFonts w:ascii="Calibri" w:cs="Calibri" w:eastAsia="Calibri" w:hAnsi="Calibri"/>
-          <w:b/>
-          <w:bCs/>
-          <w:color w:val="1A1A1A"/>
-          <w:sz w:val="21"/>
-          <w:szCs w:val="21"/>
-        </w:rPr>
-        <w:t xml:space="preserve">Cadeiras</w:t>
-      </w:r>
-    </w:p>
-    <w:p>
-      <w:pPr>
-        <w:pStyle w:val="ListParagraph"/>
-        <w:numPr>
-          <w:ilvl w:val="0"/>
-          <w:numId w:val="2"/>
-        </w:numPr>
-        <w:spacing w:after="60" w:line="290"/>
-      </w:pPr>
-      <w:r>
-        <w:rPr>
-          <w:rFonts w:ascii="Calibri" w:cs="Calibri" w:eastAsia="Calibri" w:hAnsi="Calibri"/>
-          <w:b/>
-          <w:bCs/>
-          <w:color w:val="1A1A1A"/>
-          <w:sz w:val="21"/>
-          <w:szCs w:val="21"/>
-        </w:rPr>
-        <w:t xml:space="preserve">Espreguiçadeira</w:t>
-      </w:r>
-    </w:p>
-    <w:p>
-      <w:pPr>
-        <w:pStyle w:val="ListParagraph"/>
-        <w:numPr>
-          <w:ilvl w:val="0"/>
-          <w:numId w:val="2"/>
-        </w:numPr>
-        <w:spacing w:after="60" w:line="290"/>
-      </w:pPr>
-      <w:r>
-        <w:rPr>
-          <w:rFonts w:ascii="Calibri" w:cs="Calibri" w:eastAsia="Calibri" w:hAnsi="Calibri"/>
-          <w:b/>
-          <w:bCs/>
-          <w:color w:val="1A1A1A"/>
-          <w:sz w:val="21"/>
-          <w:szCs w:val="21"/>
-        </w:rPr>
-        <w:t xml:space="preserve">Mesinha</w:t>
-      </w:r>
-    </w:p>
-    <w:p>
-      <w:pPr>
-        <w:pStyle w:val="ListParagraph"/>
-        <w:numPr>
-          <w:ilvl w:val="0"/>
-          <w:numId w:val="2"/>
-        </w:numPr>
-        <w:spacing w:after="60" w:line="290"/>
-      </w:pPr>
-      <w:r>
-        <w:rPr>
-          <w:rFonts w:ascii="Calibri" w:cs="Calibri" w:eastAsia="Calibri" w:hAnsi="Calibri"/>
-          <w:color w:val="1A1A1A"/>
-          <w:sz w:val="21"/>
-          <w:szCs w:val="21"/>
-        </w:rPr>
-        <w:t xml:space="preserve">Atendimento de bebidas e porções na areia, </w:t>
-      </w:r>
-      <w:r>
-        <w:rPr>
-          <w:rFonts w:ascii="Calibri" w:cs="Calibri" w:eastAsia="Calibri" w:hAnsi="Calibri"/>
-          <w:b/>
-          <w:bCs/>
-          <w:color w:val="1A1A1A"/>
-          <w:sz w:val="21"/>
-          <w:szCs w:val="21"/>
-        </w:rPr>
-        <w:t xml:space="preserve">sem taxa de serviço</w:t>
-      </w:r>
-    </w:p>
-    <w:p>
-      <w:pPr>
-        <w:keepNext/>
-        <w:spacing w:after="200" w:before="360"/>
-      </w:pPr>
-      <w:r>
-        <w:rPr>
-          <w:rFonts w:ascii="Calibri" w:cs="Calibri" w:eastAsia="Calibri" w:hAnsi="Calibri"/>
-          <w:b/>
-          <w:bCs/>
-          <w:color w:val="049DD9"/>
-          <w:sz w:val="30"/>
-          <w:szCs w:val="30"/>
-        </w:rPr>
-        <w:t xml:space="preserve">2.5 ÁREAS COMUNS</w:t>
-      </w:r>
-    </w:p>
-    <w:p>
-      <w:pPr>
-        <w:pStyle w:val="ListParagraph"/>
-        <w:numPr>
-          <w:ilvl w:val="0"/>
-          <w:numId w:val="2"/>
-        </w:numPr>
-        <w:spacing w:after="60" w:line="290"/>
-      </w:pPr>
-      <w:r>
-        <w:rPr>
-          <w:rFonts w:ascii="Calibri" w:cs="Calibri" w:eastAsia="Calibri" w:hAnsi="Calibri"/>
-          <w:b/>
-          <w:bCs/>
-          <w:color w:val="1A1A1A"/>
-          <w:sz w:val="21"/>
-          <w:szCs w:val="21"/>
-        </w:rPr>
-        <w:t xml:space="preserve">Piscina climatizada</w:t>
-      </w:r>
-      <w:r>
-        <w:rPr>
-          <w:rFonts w:ascii="Calibri" w:cs="Calibri" w:eastAsia="Calibri" w:hAnsi="Calibri"/>
-          <w:color w:val="1A1A1A"/>
-          <w:sz w:val="21"/>
-          <w:szCs w:val="21"/>
-        </w:rPr>
-        <w:t xml:space="preserve"> — funciona o ano inteiro; é o diferencial de baixa temporada.</w:t>
-      </w:r>
-    </w:p>
-    <w:p>
-      <w:pPr>
-        <w:pStyle w:val="ListParagraph"/>
-        <w:numPr>
-          <w:ilvl w:val="0"/>
-          <w:numId w:val="2"/>
-        </w:numPr>
-        <w:spacing w:after="60" w:line="290"/>
-      </w:pPr>
-      <w:r>
-        <w:rPr>
-          <w:rFonts w:ascii="Calibri" w:cs="Calibri" w:eastAsia="Calibri" w:hAnsi="Calibri"/>
-          <w:b/>
-          <w:bCs/>
-          <w:color w:val="1A1A1A"/>
-          <w:sz w:val="21"/>
-          <w:szCs w:val="21"/>
-        </w:rPr>
-        <w:t xml:space="preserve">Salão multifuncional</w:t>
-      </w:r>
-      <w:r>
-        <w:rPr>
-          <w:rFonts w:ascii="Calibri" w:cs="Calibri" w:eastAsia="Calibri" w:hAnsi="Calibri"/>
-          <w:color w:val="1A1A1A"/>
-          <w:sz w:val="21"/>
-          <w:szCs w:val="21"/>
-        </w:rPr>
-        <w:t xml:space="preserve"> com </w:t>
-      </w:r>
-      <w:r>
-        <w:rPr>
-          <w:rFonts w:ascii="Calibri" w:cs="Calibri" w:eastAsia="Calibri" w:hAnsi="Calibri"/>
-          <w:b/>
-          <w:bCs/>
-          <w:color w:val="1A1A1A"/>
-          <w:sz w:val="21"/>
-          <w:szCs w:val="21"/>
-        </w:rPr>
-        <w:t xml:space="preserve">monitor de 82 polegadas</w:t>
-      </w:r>
-      <w:r>
-        <w:rPr>
-          <w:rFonts w:ascii="Calibri" w:cs="Calibri" w:eastAsia="Calibri" w:hAnsi="Calibri"/>
-          <w:color w:val="1A1A1A"/>
-          <w:sz w:val="21"/>
-          <w:szCs w:val="21"/>
-        </w:rPr>
-        <w:t xml:space="preserve"> — reuniões, pequenos eventos, confraternizações, dia de chuva, retiros e famílias grandes.</w:t>
-      </w:r>
-    </w:p>
-    <w:p>
-      <w:pPr>
-        <w:keepNext/>
-        <w:spacing w:after="200" w:before="360"/>
-      </w:pPr>
-      <w:r>
-        <w:rPr>
-          <w:rFonts w:ascii="Calibri" w:cs="Calibri" w:eastAsia="Calibri" w:hAnsi="Calibri"/>
-          <w:b/>
-          <w:bCs/>
-          <w:color w:val="049DD9"/>
-          <w:sz w:val="30"/>
-          <w:szCs w:val="30"/>
-        </w:rPr>
-        <w:t xml:space="preserve">2.6 INFRAESTRUTURA INVISÍVEL</w:t>
-      </w:r>
-    </w:p>
-    <w:p>
-      <w:pPr>
-        <w:pStyle w:val="ListParagraph"/>
-        <w:numPr>
-          <w:ilvl w:val="0"/>
-          <w:numId w:val="2"/>
-        </w:numPr>
-        <w:spacing w:after="60" w:line="290"/>
-      </w:pPr>
-      <w:r>
-        <w:rPr>
-          <w:rFonts w:ascii="Calibri" w:cs="Calibri" w:eastAsia="Calibri" w:hAnsi="Calibri"/>
-          <w:b/>
-          <w:bCs/>
-          <w:color w:val="1A1A1A"/>
-          <w:sz w:val="21"/>
-          <w:szCs w:val="21"/>
-        </w:rPr>
-        <w:t xml:space="preserve">Gerador próprio</w:t>
-      </w:r>
-      <w:r>
-        <w:rPr>
-          <w:rFonts w:ascii="Calibri" w:cs="Calibri" w:eastAsia="Calibri" w:hAnsi="Calibri"/>
-          <w:color w:val="1A1A1A"/>
-          <w:sz w:val="21"/>
-          <w:szCs w:val="21"/>
-        </w:rPr>
-        <w:t xml:space="preserve"> que sustenta </w:t>
-      </w:r>
-      <w:r>
-        <w:rPr>
-          <w:rFonts w:ascii="Calibri" w:cs="Calibri" w:eastAsia="Calibri" w:hAnsi="Calibri"/>
-          <w:b/>
-          <w:bCs/>
-          <w:color w:val="1A1A1A"/>
-          <w:sz w:val="21"/>
-          <w:szCs w:val="21"/>
-        </w:rPr>
-        <w:t xml:space="preserve">a pousada inteira</w:t>
-      </w:r>
-      <w:r>
-        <w:rPr>
-          <w:rFonts w:ascii="Calibri" w:cs="Calibri" w:eastAsia="Calibri" w:hAnsi="Calibri"/>
-          <w:color w:val="1A1A1A"/>
-          <w:sz w:val="21"/>
-          <w:szCs w:val="21"/>
-        </w:rPr>
-        <w:t xml:space="preserve"> — a operação não para em queda de energia.</w:t>
-      </w:r>
-    </w:p>
-    <w:p>
-      <w:pPr>
-        <w:pStyle w:val="ListParagraph"/>
-        <w:numPr>
-          <w:ilvl w:val="0"/>
-          <w:numId w:val="2"/>
-        </w:numPr>
-        <w:spacing w:after="60" w:line="290"/>
-      </w:pPr>
-      <w:r>
-        <w:rPr>
-          <w:rFonts w:ascii="Calibri" w:cs="Calibri" w:eastAsia="Calibri" w:hAnsi="Calibri"/>
-          <w:b/>
-          <w:bCs/>
-          <w:color w:val="1A1A1A"/>
-          <w:sz w:val="21"/>
-          <w:szCs w:val="21"/>
-        </w:rPr>
-        <w:t xml:space="preserve">Placas fotovoltaicas</w:t>
-      </w:r>
-      <w:r>
-        <w:rPr>
-          <w:rFonts w:ascii="Calibri" w:cs="Calibri" w:eastAsia="Calibri" w:hAnsi="Calibri"/>
-          <w:color w:val="1A1A1A"/>
-          <w:sz w:val="21"/>
-          <w:szCs w:val="21"/>
-        </w:rPr>
-        <w:t xml:space="preserve"> — parte da operação sustentável.</w:t>
-      </w:r>
-    </w:p>
-    <w:p>
-      <w:pPr>
-        <w:pBdr>
-          <w:left w:val="single" w:color="04B2D9" w:sz="18" w:space="14"/>
-        </w:pBdr>
-        <w:spacing w:after="200" w:before="160" w:line="320"/>
-        <w:ind w:left="460"/>
-      </w:pPr>
-      <w:r>
-        <w:rPr>
-          <w:rFonts w:ascii="Calibri" w:cs="Calibri" w:eastAsia="Calibri" w:hAnsi="Calibri"/>
-          <w:i w:val="false"/>
-          <w:iCs w:val="false"/>
-          <w:color w:val="2C3E44"/>
-          <w:sz w:val="22"/>
-          <w:szCs w:val="22"/>
-        </w:rPr>
-        <w:t xml:space="preserve">Este é o item mais subaproveitado da marca. Gerador e energia solar </w:t>
-      </w:r>
-      <w:r>
-        <w:rPr>
-          <w:rFonts w:ascii="Calibri" w:cs="Calibri" w:eastAsia="Calibri" w:hAnsi="Calibri"/>
-          <w:b/>
-          <w:bCs/>
-          <w:i w:val="false"/>
-          <w:iCs w:val="false"/>
-          <w:color w:val="0E3740"/>
-          <w:sz w:val="22"/>
-          <w:szCs w:val="22"/>
-        </w:rPr>
-        <w:t xml:space="preserve">são</w:t>
-      </w:r>
-      <w:r>
-        <w:rPr>
-          <w:rFonts w:ascii="Calibri" w:cs="Calibri" w:eastAsia="Calibri" w:hAnsi="Calibri"/>
-          <w:i w:val="false"/>
-          <w:iCs w:val="false"/>
-          <w:color w:val="2C3E44"/>
-          <w:sz w:val="22"/>
-          <w:szCs w:val="22"/>
-        </w:rPr>
-        <w:t xml:space="preserve"> o conceito-âncora em forma de equipamento: o hóspede só percebe quando a rua inteira apaga e aqui não acontece nada.</w:t>
-      </w:r>
-    </w:p>
-    <w:p>
-      <w:pPr>
-        <w:keepNext/>
-        <w:spacing w:after="200" w:before="360"/>
-      </w:pPr>
-      <w:r>
-        <w:rPr>
-          <w:rFonts w:ascii="Calibri" w:cs="Calibri" w:eastAsia="Calibri" w:hAnsi="Calibri"/>
-          <w:b/>
-          <w:bCs/>
-          <w:color w:val="049DD9"/>
-          <w:sz w:val="30"/>
-          <w:szCs w:val="30"/>
-        </w:rPr>
-        <w:t xml:space="preserve">2.7 LOCALIZAÇÃO</w:t>
-      </w:r>
-    </w:p>
-    <w:p>
-      <w:pPr>
-        <w:pStyle w:val="ListParagraph"/>
-        <w:numPr>
-          <w:ilvl w:val="0"/>
-          <w:numId w:val="2"/>
-        </w:numPr>
-        <w:spacing w:after="60" w:line="290"/>
-      </w:pPr>
-      <w:r>
-        <w:rPr>
-          <w:rFonts w:ascii="Calibri" w:cs="Calibri" w:eastAsia="Calibri" w:hAnsi="Calibri"/>
-          <w:b/>
-          <w:bCs/>
-          <w:color w:val="1A1A1A"/>
-          <w:sz w:val="21"/>
-          <w:szCs w:val="21"/>
-        </w:rPr>
-        <w:t xml:space="preserve">170 metros da praia</w:t>
-      </w:r>
-    </w:p>
-    <w:p>
-      <w:pPr>
-        <w:pStyle w:val="ListParagraph"/>
-        <w:numPr>
-          <w:ilvl w:val="0"/>
-          <w:numId w:val="2"/>
-        </w:numPr>
-        <w:spacing w:after="60" w:line="290"/>
-      </w:pPr>
-      <w:r>
-        <w:rPr>
-          <w:rFonts w:ascii="Calibri" w:cs="Calibri" w:eastAsia="Calibri" w:hAnsi="Calibri"/>
-          <w:b/>
-          <w:bCs/>
-          <w:color w:val="1A1A1A"/>
-          <w:sz w:val="21"/>
-          <w:szCs w:val="21"/>
-        </w:rPr>
-        <w:t xml:space="preserve">≈ 400 metros do centrinho de Camburi</w:t>
-      </w:r>
-    </w:p>
-    <w:p>
-      <w:pPr>
-        <w:pStyle w:val="ListParagraph"/>
-        <w:numPr>
-          <w:ilvl w:val="0"/>
-          <w:numId w:val="2"/>
-        </w:numPr>
-        <w:spacing w:after="60" w:line="290"/>
-      </w:pPr>
-      <w:r>
-        <w:rPr>
-          <w:rFonts w:ascii="Calibri" w:cs="Calibri" w:eastAsia="Calibri" w:hAnsi="Calibri"/>
-          <w:color w:val="1A1A1A"/>
-          <w:sz w:val="21"/>
-          <w:szCs w:val="21"/>
-        </w:rPr>
-        <w:t xml:space="preserve">≈ 2h30 da capital paulista</w:t>
-      </w:r>
-    </w:p>
-    <w:p>
-      <w:pPr>
-        <w:keepNext/>
-        <w:spacing w:after="200" w:before="360"/>
-      </w:pPr>
-      <w:r>
-        <w:rPr>
-          <w:rFonts w:ascii="Calibri" w:cs="Calibri" w:eastAsia="Calibri" w:hAnsi="Calibri"/>
-          <w:b/>
-          <w:bCs/>
-          <w:color w:val="049DD9"/>
-          <w:sz w:val="30"/>
-          <w:szCs w:val="30"/>
-        </w:rPr>
-        <w:t xml:space="preserve">2.8 CORTESIAS PERMANENTES</w:t>
-      </w:r>
-    </w:p>
-    <w:p>
-      <w:pPr>
-        <w:pStyle w:val="ListParagraph"/>
-        <w:numPr>
-          <w:ilvl w:val="0"/>
-          <w:numId w:val="2"/>
-        </w:numPr>
-        <w:spacing w:after="60" w:line="290"/>
-      </w:pPr>
-      <w:r>
-        <w:rPr>
-          <w:rFonts w:ascii="Calibri" w:cs="Calibri" w:eastAsia="Calibri" w:hAnsi="Calibri"/>
-          <w:b/>
-          <w:bCs/>
-          <w:color w:val="1A1A1A"/>
-          <w:sz w:val="21"/>
-          <w:szCs w:val="21"/>
-        </w:rPr>
-        <w:t xml:space="preserve">Café expresso, chá e fruta</w:t>
-      </w:r>
-      <w:r>
-        <w:rPr>
-          <w:rFonts w:ascii="Calibri" w:cs="Calibri" w:eastAsia="Calibri" w:hAnsi="Calibri"/>
-          <w:color w:val="1A1A1A"/>
-          <w:sz w:val="21"/>
-          <w:szCs w:val="21"/>
-        </w:rPr>
-        <w:t xml:space="preserve"> — sempre disponíveis, o dia todo, sem cobrança.</w:t>
-      </w:r>
-    </w:p>
-    <w:p>
-      <w:pPr>
-        <w:pStyle w:val="ListParagraph"/>
-        <w:numPr>
-          <w:ilvl w:val="0"/>
-          <w:numId w:val="2"/>
-        </w:numPr>
-        <w:spacing w:after="60" w:line="290"/>
-      </w:pPr>
-      <w:r>
-        <w:rPr>
-          <w:rFonts w:ascii="Calibri" w:cs="Calibri" w:eastAsia="Calibri" w:hAnsi="Calibri"/>
-          <w:b/>
-          <w:bCs/>
-          <w:color w:val="1A1A1A"/>
-          <w:sz w:val="21"/>
-          <w:szCs w:val="21"/>
-        </w:rPr>
-        <w:t xml:space="preserve">Kit amenities completo.</w:t>
-      </w:r>
-    </w:p>
-    <w:p>
-      <w:pPr>
-        <w:pStyle w:val="ListParagraph"/>
-        <w:numPr>
-          <w:ilvl w:val="0"/>
-          <w:numId w:val="2"/>
-        </w:numPr>
-        <w:spacing w:after="60" w:line="290"/>
-      </w:pPr>
-      <w:r>
-        <w:rPr>
-          <w:rFonts w:ascii="Calibri" w:cs="Calibri" w:eastAsia="Calibri" w:hAnsi="Calibri"/>
-          <w:b/>
-          <w:bCs/>
-          <w:color w:val="1A1A1A"/>
-          <w:sz w:val="21"/>
-          <w:szCs w:val="21"/>
-        </w:rPr>
-        <w:t xml:space="preserve">Check-in antecipado para todos</w:t>
-      </w:r>
-      <w:r>
-        <w:rPr>
-          <w:rFonts w:ascii="Calibri" w:cs="Calibri" w:eastAsia="Calibri" w:hAnsi="Calibri"/>
-          <w:color w:val="1A1A1A"/>
-          <w:sz w:val="21"/>
-          <w:szCs w:val="21"/>
-        </w:rPr>
-        <w:t xml:space="preserve">, quando houver disponibilidade.</w:t>
-      </w:r>
-    </w:p>
-    <w:p>
-      <w:pPr>
-        <w:pStyle w:val="ListParagraph"/>
-        <w:numPr>
-          <w:ilvl w:val="0"/>
-          <w:numId w:val="2"/>
-        </w:numPr>
-        <w:spacing w:after="60" w:line="290"/>
-      </w:pPr>
-      <w:r>
-        <w:rPr>
-          <w:rFonts w:ascii="Calibri" w:cs="Calibri" w:eastAsia="Calibri" w:hAnsi="Calibri"/>
-          <w:b/>
-          <w:bCs/>
-          <w:color w:val="1A1A1A"/>
-          <w:sz w:val="21"/>
-          <w:szCs w:val="21"/>
-        </w:rPr>
-        <w:t xml:space="preserve">Sugestões personalizadas</w:t>
-      </w:r>
-      <w:r>
-        <w:rPr>
-          <w:rFonts w:ascii="Calibri" w:cs="Calibri" w:eastAsia="Calibri" w:hAnsi="Calibri"/>
-          <w:color w:val="1A1A1A"/>
-          <w:sz w:val="21"/>
-          <w:szCs w:val="21"/>
-        </w:rPr>
-        <w:t xml:space="preserve"> de atividades, roteiros e restaurantes.</w:t>
-      </w:r>
-    </w:p>
-    <w:p>
-      <w:pPr>
-        <w:keepNext/>
-        <w:spacing w:after="200" w:before="360"/>
-      </w:pPr>
-      <w:r>
-        <w:rPr>
-          <w:rFonts w:ascii="Calibri" w:cs="Calibri" w:eastAsia="Calibri" w:hAnsi="Calibri"/>
-          <w:b/>
-          <w:bCs/>
-          <w:color w:val="049DD9"/>
-          <w:sz w:val="30"/>
-          <w:szCs w:val="30"/>
-        </w:rPr>
-        <w:t xml:space="preserve">2.9 DE FATO A HISTÓRIA — tabela de tradução</w:t>
-      </w:r>
-    </w:p>
-    <w:p>
-      <w:pPr>
-        <w:spacing w:after="120" w:line="300"/>
-      </w:pPr>
-      <w:r>
-        <w:rPr>
-          <w:rFonts w:ascii="Calibri" w:cs="Calibri" w:eastAsia="Calibri" w:hAnsi="Calibri"/>
-          <w:i/>
-          <w:iCs/>
-          <w:color w:val="1A1A1A"/>
-          <w:sz w:val="21"/>
-          <w:szCs w:val="21"/>
-        </w:rPr>
-        <w:t xml:space="preserve">Como cada fato vira conteúdo sem virar folheto.</w:t>
+        <w:t xml:space="preserve">, distribuídas em seis categorias:</w:t>
       </w:r>
     </w:p>
     <w:tbl>
@@ -5956,7 +5456,7 @@
                 <w:sz w:val="19"/>
                 <w:szCs w:val="19"/>
               </w:rPr>
-              <w:t xml:space="preserve">Fato operacional</w:t>
+              <w:t xml:space="preserve">Categoria</w:t>
             </w:r>
           </w:p>
         </w:tc>
@@ -5984,7 +5484,7 @@
                 <w:sz w:val="19"/>
                 <w:szCs w:val="19"/>
               </w:rPr>
-              <w:t xml:space="preserve">Como se conta</w:t>
+              <w:t xml:space="preserve">Quantidade</w:t>
             </w:r>
           </w:p>
         </w:tc>
@@ -6014,7 +5514,7 @@
                 <w:sz w:val="19"/>
                 <w:szCs w:val="19"/>
               </w:rPr>
-              <w:t xml:space="preserve">18 suítes</w:t>
+              <w:t xml:space="preserve">Térreo duplo</w:t>
             </w:r>
           </w:p>
         </w:tc>
@@ -6042,7 +5542,1936 @@
                 <w:sz w:val="19"/>
                 <w:szCs w:val="19"/>
               </w:rPr>
+              <w:t xml:space="preserve">4</w:t>
+            </w:r>
+          </w:p>
+        </w:tc>
+      </w:tr>
+      <w:tr>
+        <w:tc>
+          <w:tcPr>
+            <w:tcW w:type="dxa" w:w="4513"/>
+            <w:shd w:fill="F2F2F2" w:color="auto" w:val="clear"/>
+            <w:tcMar>
+              <w:top w:type="dxa" w:w="80"/>
+              <w:left w:type="dxa" w:w="120"/>
+              <w:bottom w:type="dxa" w:w="80"/>
+              <w:right w:type="dxa" w:w="120"/>
+            </w:tcMar>
+          </w:tcPr>
+          <w:p>
+            <w:pPr>
+              <w:spacing w:after="0" w:line="260"/>
+            </w:pPr>
+            <w:r>
+              <w:rPr>
+                <w:rFonts w:ascii="Calibri" w:cs="Calibri" w:eastAsia="Calibri" w:hAnsi="Calibri"/>
+                <w:b w:val="false"/>
+                <w:bCs w:val="false"/>
+                <w:color w:val="1A1A1A"/>
+                <w:sz w:val="19"/>
+                <w:szCs w:val="19"/>
+              </w:rPr>
+              <w:t xml:space="preserve">Térreo duplo com varanda</w:t>
+            </w:r>
+          </w:p>
+        </w:tc>
+        <w:tc>
+          <w:tcPr>
+            <w:tcW w:type="dxa" w:w="4513"/>
+            <w:shd w:fill="F2F2F2" w:color="auto" w:val="clear"/>
+            <w:tcMar>
+              <w:top w:type="dxa" w:w="80"/>
+              <w:left w:type="dxa" w:w="120"/>
+              <w:bottom w:type="dxa" w:w="80"/>
+              <w:right w:type="dxa" w:w="120"/>
+            </w:tcMar>
+          </w:tcPr>
+          <w:p>
+            <w:pPr>
+              <w:spacing w:after="0" w:line="260"/>
+            </w:pPr>
+            <w:r>
+              <w:rPr>
+                <w:rFonts w:ascii="Calibri" w:cs="Calibri" w:eastAsia="Calibri" w:hAnsi="Calibri"/>
+                <w:b w:val="false"/>
+                <w:bCs w:val="false"/>
+                <w:color w:val="1A1A1A"/>
+                <w:sz w:val="19"/>
+                <w:szCs w:val="19"/>
+              </w:rPr>
+              <w:t xml:space="preserve">3</w:t>
+            </w:r>
+          </w:p>
+        </w:tc>
+      </w:tr>
+      <w:tr>
+        <w:tc>
+          <w:tcPr>
+            <w:tcW w:type="dxa" w:w="4513"/>
+            <w:shd w:fill="F2F2F2" w:color="auto" w:val="clear"/>
+            <w:tcMar>
+              <w:top w:type="dxa" w:w="80"/>
+              <w:left w:type="dxa" w:w="120"/>
+              <w:bottom w:type="dxa" w:w="80"/>
+              <w:right w:type="dxa" w:w="120"/>
+            </w:tcMar>
+          </w:tcPr>
+          <w:p>
+            <w:pPr>
+              <w:spacing w:after="0" w:line="260"/>
+            </w:pPr>
+            <w:r>
+              <w:rPr>
+                <w:rFonts w:ascii="Calibri" w:cs="Calibri" w:eastAsia="Calibri" w:hAnsi="Calibri"/>
+                <w:b w:val="false"/>
+                <w:bCs w:val="false"/>
+                <w:color w:val="1A1A1A"/>
+                <w:sz w:val="19"/>
+                <w:szCs w:val="19"/>
+              </w:rPr>
+              <w:t xml:space="preserve">Superior duplo</w:t>
+            </w:r>
+          </w:p>
+        </w:tc>
+        <w:tc>
+          <w:tcPr>
+            <w:tcW w:type="dxa" w:w="4513"/>
+            <w:shd w:fill="F2F2F2" w:color="auto" w:val="clear"/>
+            <w:tcMar>
+              <w:top w:type="dxa" w:w="80"/>
+              <w:left w:type="dxa" w:w="120"/>
+              <w:bottom w:type="dxa" w:w="80"/>
+              <w:right w:type="dxa" w:w="120"/>
+            </w:tcMar>
+          </w:tcPr>
+          <w:p>
+            <w:pPr>
+              <w:spacing w:after="0" w:line="260"/>
+            </w:pPr>
+            <w:r>
+              <w:rPr>
+                <w:rFonts w:ascii="Calibri" w:cs="Calibri" w:eastAsia="Calibri" w:hAnsi="Calibri"/>
+                <w:b w:val="false"/>
+                <w:bCs w:val="false"/>
+                <w:color w:val="1A1A1A"/>
+                <w:sz w:val="19"/>
+                <w:szCs w:val="19"/>
+              </w:rPr>
+              <w:t xml:space="preserve">4</w:t>
+            </w:r>
+          </w:p>
+        </w:tc>
+      </w:tr>
+      <w:tr>
+        <w:tc>
+          <w:tcPr>
+            <w:tcW w:type="dxa" w:w="4513"/>
+            <w:shd w:fill="F2F2F2" w:color="auto" w:val="clear"/>
+            <w:tcMar>
+              <w:top w:type="dxa" w:w="80"/>
+              <w:left w:type="dxa" w:w="120"/>
+              <w:bottom w:type="dxa" w:w="80"/>
+              <w:right w:type="dxa" w:w="120"/>
+            </w:tcMar>
+          </w:tcPr>
+          <w:p>
+            <w:pPr>
+              <w:spacing w:after="0" w:line="260"/>
+            </w:pPr>
+            <w:r>
+              <w:rPr>
+                <w:rFonts w:ascii="Calibri" w:cs="Calibri" w:eastAsia="Calibri" w:hAnsi="Calibri"/>
+                <w:b w:val="false"/>
+                <w:bCs w:val="false"/>
+                <w:color w:val="1A1A1A"/>
+                <w:sz w:val="19"/>
+                <w:szCs w:val="19"/>
+              </w:rPr>
+              <w:t xml:space="preserve">Térreo triplo</w:t>
+            </w:r>
+          </w:p>
+        </w:tc>
+        <w:tc>
+          <w:tcPr>
+            <w:tcW w:type="dxa" w:w="4513"/>
+            <w:shd w:fill="F2F2F2" w:color="auto" w:val="clear"/>
+            <w:tcMar>
+              <w:top w:type="dxa" w:w="80"/>
+              <w:left w:type="dxa" w:w="120"/>
+              <w:bottom w:type="dxa" w:w="80"/>
+              <w:right w:type="dxa" w:w="120"/>
+            </w:tcMar>
+          </w:tcPr>
+          <w:p>
+            <w:pPr>
+              <w:spacing w:after="0" w:line="260"/>
+            </w:pPr>
+            <w:r>
+              <w:rPr>
+                <w:rFonts w:ascii="Calibri" w:cs="Calibri" w:eastAsia="Calibri" w:hAnsi="Calibri"/>
+                <w:b w:val="false"/>
+                <w:bCs w:val="false"/>
+                <w:color w:val="1A1A1A"/>
+                <w:sz w:val="19"/>
+                <w:szCs w:val="19"/>
+              </w:rPr>
+              <w:t xml:space="preserve">2</w:t>
+            </w:r>
+          </w:p>
+        </w:tc>
+      </w:tr>
+      <w:tr>
+        <w:tc>
+          <w:tcPr>
+            <w:tcW w:type="dxa" w:w="4513"/>
+            <w:shd w:fill="F2F2F2" w:color="auto" w:val="clear"/>
+            <w:tcMar>
+              <w:top w:type="dxa" w:w="80"/>
+              <w:left w:type="dxa" w:w="120"/>
+              <w:bottom w:type="dxa" w:w="80"/>
+              <w:right w:type="dxa" w:w="120"/>
+            </w:tcMar>
+          </w:tcPr>
+          <w:p>
+            <w:pPr>
+              <w:spacing w:after="0" w:line="260"/>
+            </w:pPr>
+            <w:r>
+              <w:rPr>
+                <w:rFonts w:ascii="Calibri" w:cs="Calibri" w:eastAsia="Calibri" w:hAnsi="Calibri"/>
+                <w:b w:val="false"/>
+                <w:bCs w:val="false"/>
+                <w:color w:val="1A1A1A"/>
+                <w:sz w:val="19"/>
+                <w:szCs w:val="19"/>
+              </w:rPr>
+              <w:t xml:space="preserve">Superior triplo</w:t>
+            </w:r>
+          </w:p>
+        </w:tc>
+        <w:tc>
+          <w:tcPr>
+            <w:tcW w:type="dxa" w:w="4513"/>
+            <w:shd w:fill="F2F2F2" w:color="auto" w:val="clear"/>
+            <w:tcMar>
+              <w:top w:type="dxa" w:w="80"/>
+              <w:left w:type="dxa" w:w="120"/>
+              <w:bottom w:type="dxa" w:w="80"/>
+              <w:right w:type="dxa" w:w="120"/>
+            </w:tcMar>
+          </w:tcPr>
+          <w:p>
+            <w:pPr>
+              <w:spacing w:after="0" w:line="260"/>
+            </w:pPr>
+            <w:r>
+              <w:rPr>
+                <w:rFonts w:ascii="Calibri" w:cs="Calibri" w:eastAsia="Calibri" w:hAnsi="Calibri"/>
+                <w:b w:val="false"/>
+                <w:bCs w:val="false"/>
+                <w:color w:val="1A1A1A"/>
+                <w:sz w:val="19"/>
+                <w:szCs w:val="19"/>
+              </w:rPr>
+              <w:t xml:space="preserve">3</w:t>
+            </w:r>
+          </w:p>
+        </w:tc>
+      </w:tr>
+      <w:tr>
+        <w:tc>
+          <w:tcPr>
+            <w:tcW w:type="dxa" w:w="4513"/>
+            <w:shd w:fill="F2F2F2" w:color="auto" w:val="clear"/>
+            <w:tcMar>
+              <w:top w:type="dxa" w:w="80"/>
+              <w:left w:type="dxa" w:w="120"/>
+              <w:bottom w:type="dxa" w:w="80"/>
+              <w:right w:type="dxa" w:w="120"/>
+            </w:tcMar>
+          </w:tcPr>
+          <w:p>
+            <w:pPr>
+              <w:spacing w:after="0" w:line="260"/>
+            </w:pPr>
+            <w:r>
+              <w:rPr>
+                <w:rFonts w:ascii="Calibri" w:cs="Calibri" w:eastAsia="Calibri" w:hAnsi="Calibri"/>
+                <w:b w:val="false"/>
+                <w:bCs w:val="false"/>
+                <w:color w:val="1A1A1A"/>
+                <w:sz w:val="19"/>
+                <w:szCs w:val="19"/>
+              </w:rPr>
+              <w:t xml:space="preserve">Superior quádruplo</w:t>
+            </w:r>
+          </w:p>
+        </w:tc>
+        <w:tc>
+          <w:tcPr>
+            <w:tcW w:type="dxa" w:w="4513"/>
+            <w:shd w:fill="F2F2F2" w:color="auto" w:val="clear"/>
+            <w:tcMar>
+              <w:top w:type="dxa" w:w="80"/>
+              <w:left w:type="dxa" w:w="120"/>
+              <w:bottom w:type="dxa" w:w="80"/>
+              <w:right w:type="dxa" w:w="120"/>
+            </w:tcMar>
+          </w:tcPr>
+          <w:p>
+            <w:pPr>
+              <w:spacing w:after="0" w:line="260"/>
+            </w:pPr>
+            <w:r>
+              <w:rPr>
+                <w:rFonts w:ascii="Calibri" w:cs="Calibri" w:eastAsia="Calibri" w:hAnsi="Calibri"/>
+                <w:b w:val="false"/>
+                <w:bCs w:val="false"/>
+                <w:color w:val="1A1A1A"/>
+                <w:sz w:val="19"/>
+                <w:szCs w:val="19"/>
+              </w:rPr>
+              <w:t xml:space="preserve">2</w:t>
+            </w:r>
+          </w:p>
+        </w:tc>
+      </w:tr>
+      <w:tr>
+        <w:tc>
+          <w:tcPr>
+            <w:tcW w:type="dxa" w:w="4513"/>
+            <w:shd w:fill="F2F2F2" w:color="auto" w:val="clear"/>
+            <w:tcMar>
+              <w:top w:type="dxa" w:w="80"/>
+              <w:left w:type="dxa" w:w="120"/>
+              <w:bottom w:type="dxa" w:w="80"/>
+              <w:right w:type="dxa" w:w="120"/>
+            </w:tcMar>
+          </w:tcPr>
+          <w:p>
+            <w:pPr>
+              <w:spacing w:after="0" w:line="260"/>
+            </w:pPr>
+            <w:r>
+              <w:rPr>
+                <w:rFonts w:ascii="Calibri" w:cs="Calibri" w:eastAsia="Calibri" w:hAnsi="Calibri"/>
+                <w:b/>
+                <w:bCs/>
+                <w:color w:val="0E3740"/>
+                <w:sz w:val="19"/>
+                <w:szCs w:val="19"/>
+              </w:rPr>
+              <w:t xml:space="preserve">Total</w:t>
+            </w:r>
+          </w:p>
+        </w:tc>
+        <w:tc>
+          <w:tcPr>
+            <w:tcW w:type="dxa" w:w="4513"/>
+            <w:shd w:fill="F2F2F2" w:color="auto" w:val="clear"/>
+            <w:tcMar>
+              <w:top w:type="dxa" w:w="80"/>
+              <w:left w:type="dxa" w:w="120"/>
+              <w:bottom w:type="dxa" w:w="80"/>
+              <w:right w:type="dxa" w:w="120"/>
+            </w:tcMar>
+          </w:tcPr>
+          <w:p>
+            <w:pPr>
+              <w:spacing w:after="0" w:line="260"/>
+            </w:pPr>
+            <w:r>
+              <w:rPr>
+                <w:rFonts w:ascii="Calibri" w:cs="Calibri" w:eastAsia="Calibri" w:hAnsi="Calibri"/>
+                <w:b/>
+                <w:bCs/>
+                <w:color w:val="0E3740"/>
+                <w:sz w:val="19"/>
+                <w:szCs w:val="19"/>
+              </w:rPr>
+              <w:t xml:space="preserve">18</w:t>
+            </w:r>
+          </w:p>
+        </w:tc>
+      </w:tr>
+    </w:tbl>
+    <w:p>
+      <w:pPr>
+        <w:spacing w:after="200"/>
+      </w:pPr>
+      <w:r>
+        <w:t xml:space="preserve"/>
+      </w:r>
+    </w:p>
+    <w:p>
+      <w:pPr>
+        <w:spacing w:after="120" w:line="300"/>
+      </w:pPr>
+      <w:r>
+        <w:rPr>
+          <w:rFonts w:ascii="Calibri" w:cs="Calibri" w:eastAsia="Calibri" w:hAnsi="Calibri"/>
+          <w:b/>
+          <w:bCs/>
+          <w:color w:val="1A1A1A"/>
+          <w:sz w:val="21"/>
+          <w:szCs w:val="21"/>
+        </w:rPr>
+        <w:t xml:space="preserve">Leitura da distribuição</w:t>
+      </w:r>
+      <w:r>
+        <w:rPr>
+          <w:rFonts w:ascii="Calibri" w:cs="Calibri" w:eastAsia="Calibri" w:hAnsi="Calibri"/>
+          <w:color w:val="1A1A1A"/>
+          <w:sz w:val="21"/>
+          <w:szCs w:val="21"/>
+        </w:rPr>
+        <w:t xml:space="preserve"> — útil na hora de escrever:</w:t>
+      </w:r>
+    </w:p>
+    <w:p>
+      <w:pPr>
+        <w:pStyle w:val="ListParagraph"/>
+        <w:numPr>
+          <w:ilvl w:val="0"/>
+          <w:numId w:val="2"/>
+        </w:numPr>
+        <w:spacing w:after="60" w:line="290"/>
+      </w:pPr>
+      <w:r>
+        <w:rPr>
+          <w:rFonts w:ascii="Calibri" w:cs="Calibri" w:eastAsia="Calibri" w:hAnsi="Calibri"/>
+          <w:b/>
+          <w:bCs/>
+          <w:color w:val="1A1A1A"/>
+          <w:sz w:val="21"/>
+          <w:szCs w:val="21"/>
+        </w:rPr>
+        <w:t xml:space="preserve">11 duplos, 5 triplos, 2 quádruplos.</w:t>
+      </w:r>
+      <w:r>
+        <w:rPr>
+          <w:rFonts w:ascii="Calibri" w:cs="Calibri" w:eastAsia="Calibri" w:hAnsi="Calibri"/>
+          <w:color w:val="1A1A1A"/>
+          <w:sz w:val="21"/>
+          <w:szCs w:val="21"/>
+        </w:rPr>
+        <w:t xml:space="preserve"> A casa é feita para casal, mas cabe a família inteira.</w:t>
+      </w:r>
+    </w:p>
+    <w:p>
+      <w:pPr>
+        <w:pStyle w:val="ListParagraph"/>
+        <w:numPr>
+          <w:ilvl w:val="0"/>
+          <w:numId w:val="2"/>
+        </w:numPr>
+        <w:spacing w:after="60" w:line="290"/>
+      </w:pPr>
+      <w:r>
+        <w:rPr>
+          <w:rFonts w:ascii="Calibri" w:cs="Calibri" w:eastAsia="Calibri" w:hAnsi="Calibri"/>
+          <w:b/>
+          <w:bCs/>
+          <w:color w:val="1A1A1A"/>
+          <w:sz w:val="21"/>
+          <w:szCs w:val="21"/>
+        </w:rPr>
+        <w:t xml:space="preserve">9 no térreo, 9 no superior.</w:t>
+      </w:r>
+      <w:r>
+        <w:rPr>
+          <w:rFonts w:ascii="Calibri" w:cs="Calibri" w:eastAsia="Calibri" w:hAnsi="Calibri"/>
+          <w:color w:val="1A1A1A"/>
+          <w:sz w:val="21"/>
+          <w:szCs w:val="21"/>
+        </w:rPr>
+        <w:t xml:space="preserve"> Metade e metade.</w:t>
+      </w:r>
+    </w:p>
+    <w:p>
+      <w:pPr>
+        <w:pStyle w:val="ListParagraph"/>
+        <w:numPr>
+          <w:ilvl w:val="0"/>
+          <w:numId w:val="2"/>
+        </w:numPr>
+        <w:spacing w:after="60" w:line="290"/>
+      </w:pPr>
+      <w:r>
+        <w:rPr>
+          <w:rFonts w:ascii="Calibri" w:cs="Calibri" w:eastAsia="Calibri" w:hAnsi="Calibri"/>
+          <w:b/>
+          <w:bCs/>
+          <w:color w:val="1A1A1A"/>
+          <w:sz w:val="21"/>
+          <w:szCs w:val="21"/>
+        </w:rPr>
+        <w:t xml:space="preserve">Só 3 suítes têm varanda</w:t>
+      </w:r>
+      <w:r>
+        <w:rPr>
+          <w:rFonts w:ascii="Calibri" w:cs="Calibri" w:eastAsia="Calibri" w:hAnsi="Calibri"/>
+          <w:color w:val="1A1A1A"/>
+          <w:sz w:val="21"/>
+          <w:szCs w:val="21"/>
+        </w:rPr>
+        <w:t xml:space="preserve"> (térreo duplo com varanda). É a categoria mais escassa da casa — e escassez, na nossa voz, não vira urgência: vira detalhe. </w:t>
+      </w:r>
+      <w:r>
+        <w:rPr>
+          <w:rFonts w:ascii="Calibri" w:cs="Calibri" w:eastAsia="Calibri" w:hAnsi="Calibri"/>
+          <w:i/>
+          <w:iCs/>
+          <w:color w:val="1A1A1A"/>
+          <w:sz w:val="21"/>
+          <w:szCs w:val="21"/>
+        </w:rPr>
+        <w:t xml:space="preserve">"Três das dezoito têm varanda."</w:t>
+      </w:r>
+    </w:p>
+    <w:p>
+      <w:pPr>
+        <w:spacing w:after="120" w:line="300"/>
+      </w:pPr>
+      <w:r>
+        <w:rPr>
+          <w:rFonts w:ascii="Calibri" w:cs="Calibri" w:eastAsia="Calibri" w:hAnsi="Calibri"/>
+          <w:color w:val="1A1A1A"/>
+          <w:sz w:val="21"/>
+          <w:szCs w:val="21"/>
+        </w:rPr>
+        <w:t xml:space="preserve">A escala é argumento de marca: 18 suítes significam que dá para saber o nome de quem chega.</w:t>
+      </w:r>
+    </w:p>
+    <w:p>
+      <w:pPr>
+        <w:keepNext/>
+        <w:spacing w:after="200" w:before="360"/>
+      </w:pPr>
+      <w:r>
+        <w:rPr>
+          <w:rFonts w:ascii="Calibri" w:cs="Calibri" w:eastAsia="Calibri" w:hAnsi="Calibri"/>
+          <w:b/>
+          <w:bCs/>
+          <w:color w:val="049DD9"/>
+          <w:sz w:val="30"/>
+          <w:szCs w:val="30"/>
+        </w:rPr>
+        <w:t xml:space="preserve">2.2 CAFÉ DA MANHÃ</w:t>
+      </w:r>
+    </w:p>
+    <w:p>
+      <w:pPr>
+        <w:pStyle w:val="ListParagraph"/>
+        <w:numPr>
+          <w:ilvl w:val="0"/>
+          <w:numId w:val="2"/>
+        </w:numPr>
+        <w:spacing w:after="60" w:line="290"/>
+      </w:pPr>
+      <w:r>
+        <w:rPr>
+          <w:rFonts w:ascii="Calibri" w:cs="Calibri" w:eastAsia="Calibri" w:hAnsi="Calibri"/>
+          <w:b/>
+          <w:bCs/>
+          <w:color w:val="1A1A1A"/>
+          <w:sz w:val="21"/>
+          <w:szCs w:val="21"/>
+        </w:rPr>
+        <w:t xml:space="preserve">Buffet continental</w:t>
+      </w:r>
+      <w:r>
+        <w:rPr>
+          <w:rFonts w:ascii="Calibri" w:cs="Calibri" w:eastAsia="Calibri" w:hAnsi="Calibri"/>
+          <w:color w:val="1A1A1A"/>
+          <w:sz w:val="21"/>
+          <w:szCs w:val="21"/>
+        </w:rPr>
+        <w:t xml:space="preserve">, com dois preparos feitos na hora, sob pedido:</w:t>
+      </w:r>
+    </w:p>
+    <w:p>
+      <w:pPr>
+        <w:pStyle w:val="ListParagraph"/>
+        <w:numPr>
+          <w:ilvl w:val="1"/>
+          <w:numId w:val="2"/>
+        </w:numPr>
+        <w:spacing w:after="60" w:line="290"/>
+      </w:pPr>
+      <w:r>
+        <w:rPr>
+          <w:rFonts w:ascii="Calibri" w:cs="Calibri" w:eastAsia="Calibri" w:hAnsi="Calibri"/>
+          <w:b/>
+          <w:bCs/>
+          <w:color w:val="1A1A1A"/>
+          <w:sz w:val="21"/>
+          <w:szCs w:val="21"/>
+        </w:rPr>
+        <w:t xml:space="preserve">Ovos</w:t>
+      </w:r>
+      <w:r>
+        <w:rPr>
+          <w:rFonts w:ascii="Calibri" w:cs="Calibri" w:eastAsia="Calibri" w:hAnsi="Calibri"/>
+          <w:color w:val="1A1A1A"/>
+          <w:sz w:val="21"/>
+          <w:szCs w:val="21"/>
+        </w:rPr>
+        <w:t xml:space="preserve"> — do jeito que cada um gosta</w:t>
+      </w:r>
+    </w:p>
+    <w:p>
+      <w:pPr>
+        <w:pStyle w:val="ListParagraph"/>
+        <w:numPr>
+          <w:ilvl w:val="1"/>
+          <w:numId w:val="2"/>
+        </w:numPr>
+        <w:spacing w:after="60" w:line="290"/>
+      </w:pPr>
+      <w:r>
+        <w:rPr>
+          <w:rFonts w:ascii="Calibri" w:cs="Calibri" w:eastAsia="Calibri" w:hAnsi="Calibri"/>
+          <w:b/>
+          <w:bCs/>
+          <w:color w:val="1A1A1A"/>
+          <w:sz w:val="21"/>
+          <w:szCs w:val="21"/>
+        </w:rPr>
+        <w:t xml:space="preserve">Tapioca</w:t>
+      </w:r>
+    </w:p>
+    <w:p>
+      <w:pPr>
+        <w:pStyle w:val="ListParagraph"/>
+        <w:numPr>
+          <w:ilvl w:val="0"/>
+          <w:numId w:val="2"/>
+        </w:numPr>
+        <w:spacing w:after="60" w:line="290"/>
+      </w:pPr>
+      <w:r>
+        <w:rPr>
+          <w:rFonts w:ascii="Calibri" w:cs="Calibri" w:eastAsia="Calibri" w:hAnsi="Calibri"/>
+          <w:b/>
+          <w:bCs/>
+          <w:color w:val="1A1A1A"/>
+          <w:sz w:val="21"/>
+          <w:szCs w:val="21"/>
+        </w:rPr>
+        <w:t xml:space="preserve">Geleia artesanal</w:t>
+      </w:r>
+      <w:r>
+        <w:rPr>
+          <w:rFonts w:ascii="Calibri" w:cs="Calibri" w:eastAsia="Calibri" w:hAnsi="Calibri"/>
+          <w:color w:val="1A1A1A"/>
+          <w:sz w:val="21"/>
+          <w:szCs w:val="21"/>
+        </w:rPr>
+        <w:t xml:space="preserve"> e </w:t>
+      </w:r>
+      <w:r>
+        <w:rPr>
+          <w:rFonts w:ascii="Calibri" w:cs="Calibri" w:eastAsia="Calibri" w:hAnsi="Calibri"/>
+          <w:b/>
+          <w:bCs/>
+          <w:color w:val="1A1A1A"/>
+          <w:sz w:val="21"/>
+          <w:szCs w:val="21"/>
+        </w:rPr>
+        <w:t xml:space="preserve">coalhada artesanal</w:t>
+      </w:r>
+      <w:r>
+        <w:rPr>
+          <w:rFonts w:ascii="Calibri" w:cs="Calibri" w:eastAsia="Calibri" w:hAnsi="Calibri"/>
+          <w:color w:val="1A1A1A"/>
+          <w:sz w:val="21"/>
+          <w:szCs w:val="21"/>
+        </w:rPr>
+        <w:t xml:space="preserve"> — produção própria.</w:t>
+      </w:r>
+    </w:p>
+    <w:p>
+      <w:pPr>
+        <w:pStyle w:val="ListParagraph"/>
+        <w:numPr>
+          <w:ilvl w:val="0"/>
+          <w:numId w:val="2"/>
+        </w:numPr>
+        <w:spacing w:after="60" w:line="290"/>
+      </w:pPr>
+      <w:r>
+        <w:rPr>
+          <w:rFonts w:ascii="Calibri" w:cs="Calibri" w:eastAsia="Calibri" w:hAnsi="Calibri"/>
+          <w:color w:val="1A1A1A"/>
+          <w:sz w:val="21"/>
+          <w:szCs w:val="21"/>
+        </w:rPr>
+        <w:t xml:space="preserve">É o serviço mais citado nas avaliações. É o principal ativo de conteúdo da pousada.</w:t>
+      </w:r>
+    </w:p>
+    <w:p>
+      <w:pPr>
+        <w:keepNext/>
+        <w:spacing w:after="200" w:before="360"/>
+      </w:pPr>
+      <w:r>
+        <w:rPr>
+          <w:rFonts w:ascii="Calibri" w:cs="Calibri" w:eastAsia="Calibri" w:hAnsi="Calibri"/>
+          <w:b/>
+          <w:bCs/>
+          <w:color w:val="049DD9"/>
+          <w:sz w:val="30"/>
+          <w:szCs w:val="30"/>
+        </w:rPr>
+        <w:t xml:space="preserve">2.3 RESTAURANTE, BAR E ADEGA</w:t>
+      </w:r>
+    </w:p>
+    <w:p>
+      <w:pPr>
+        <w:pStyle w:val="ListParagraph"/>
+        <w:numPr>
+          <w:ilvl w:val="0"/>
+          <w:numId w:val="2"/>
+        </w:numPr>
+        <w:spacing w:after="60" w:line="290"/>
+      </w:pPr>
+      <w:r>
+        <w:rPr>
+          <w:rFonts w:ascii="Calibri" w:cs="Calibri" w:eastAsia="Calibri" w:hAnsi="Calibri"/>
+          <w:b/>
+          <w:bCs/>
+          <w:color w:val="1A1A1A"/>
+          <w:sz w:val="21"/>
+          <w:szCs w:val="21"/>
+        </w:rPr>
+        <w:t xml:space="preserve">Restaurante próprio</w:t>
+      </w:r>
+      <w:r>
+        <w:rPr>
+          <w:rFonts w:ascii="Calibri" w:cs="Calibri" w:eastAsia="Calibri" w:hAnsi="Calibri"/>
+          <w:color w:val="1A1A1A"/>
+          <w:sz w:val="21"/>
+          <w:szCs w:val="21"/>
+        </w:rPr>
+        <w:t xml:space="preserve"> para almoço.</w:t>
+      </w:r>
+    </w:p>
+    <w:p>
+      <w:pPr>
+        <w:pStyle w:val="ListParagraph"/>
+        <w:numPr>
+          <w:ilvl w:val="0"/>
+          <w:numId w:val="2"/>
+        </w:numPr>
+        <w:spacing w:after="60" w:line="290"/>
+      </w:pPr>
+      <w:r>
+        <w:rPr>
+          <w:rFonts w:ascii="Calibri" w:cs="Calibri" w:eastAsia="Calibri" w:hAnsi="Calibri"/>
+          <w:b/>
+          <w:bCs/>
+          <w:color w:val="1A1A1A"/>
+          <w:sz w:val="21"/>
+          <w:szCs w:val="21"/>
+        </w:rPr>
+        <w:t xml:space="preserve">Porções servidas na praia</w:t>
+      </w:r>
+      <w:r>
+        <w:rPr>
+          <w:rFonts w:ascii="Calibri" w:cs="Calibri" w:eastAsia="Calibri" w:hAnsi="Calibri"/>
+          <w:color w:val="1A1A1A"/>
+          <w:sz w:val="21"/>
+          <w:szCs w:val="21"/>
+        </w:rPr>
+        <w:t xml:space="preserve"> — </w:t>
+      </w:r>
+      <w:r>
+        <w:rPr>
+          <w:rFonts w:ascii="Calibri" w:cs="Calibri" w:eastAsia="Calibri" w:hAnsi="Calibri"/>
+          <w:b/>
+          <w:bCs/>
+          <w:color w:val="1A1A1A"/>
+          <w:sz w:val="21"/>
+          <w:szCs w:val="21"/>
+        </w:rPr>
+        <w:t xml:space="preserve">sem taxa de serviço</w:t>
+      </w:r>
+      <w:r>
+        <w:rPr>
+          <w:rFonts w:ascii="Calibri" w:cs="Calibri" w:eastAsia="Calibri" w:hAnsi="Calibri"/>
+          <w:color w:val="1A1A1A"/>
+          <w:sz w:val="21"/>
+          <w:szCs w:val="21"/>
+        </w:rPr>
+        <w:t xml:space="preserve">.</w:t>
+      </w:r>
+    </w:p>
+    <w:p>
+      <w:pPr>
+        <w:pStyle w:val="ListParagraph"/>
+        <w:numPr>
+          <w:ilvl w:val="0"/>
+          <w:numId w:val="2"/>
+        </w:numPr>
+        <w:spacing w:after="60" w:line="290"/>
+      </w:pPr>
+      <w:r>
+        <w:rPr>
+          <w:rFonts w:ascii="Calibri" w:cs="Calibri" w:eastAsia="Calibri" w:hAnsi="Calibri"/>
+          <w:b/>
+          <w:bCs/>
+          <w:color w:val="1A1A1A"/>
+          <w:sz w:val="21"/>
+          <w:szCs w:val="21"/>
+        </w:rPr>
+        <w:t xml:space="preserve">Bar</w:t>
+      </w:r>
+      <w:r>
+        <w:rPr>
+          <w:rFonts w:ascii="Calibri" w:cs="Calibri" w:eastAsia="Calibri" w:hAnsi="Calibri"/>
+          <w:color w:val="1A1A1A"/>
+          <w:sz w:val="21"/>
+          <w:szCs w:val="21"/>
+        </w:rPr>
+        <w:t xml:space="preserve"> para bebidas e drinks.</w:t>
+      </w:r>
+    </w:p>
+    <w:p>
+      <w:pPr>
+        <w:pStyle w:val="ListParagraph"/>
+        <w:numPr>
+          <w:ilvl w:val="0"/>
+          <w:numId w:val="2"/>
+        </w:numPr>
+        <w:spacing w:after="60" w:line="290"/>
+      </w:pPr>
+      <w:r>
+        <w:rPr>
+          <w:rFonts w:ascii="Calibri" w:cs="Calibri" w:eastAsia="Calibri" w:hAnsi="Calibri"/>
+          <w:b/>
+          <w:bCs/>
+          <w:color w:val="1A1A1A"/>
+          <w:sz w:val="21"/>
+          <w:szCs w:val="21"/>
+        </w:rPr>
+        <w:t xml:space="preserve">Adega de vinhos Luiz Argenta</w:t>
+      </w:r>
+      <w:r>
+        <w:rPr>
+          <w:rFonts w:ascii="Calibri" w:cs="Calibri" w:eastAsia="Calibri" w:hAnsi="Calibri"/>
+          <w:color w:val="1A1A1A"/>
+          <w:sz w:val="21"/>
+          <w:szCs w:val="21"/>
+        </w:rPr>
+        <w:t xml:space="preserve">.</w:t>
+      </w:r>
+    </w:p>
+    <w:p>
+      <w:pPr>
+        <w:keepNext/>
+        <w:spacing w:after="200" w:before="360"/>
+      </w:pPr>
+      <w:r>
+        <w:rPr>
+          <w:rFonts w:ascii="Calibri" w:cs="Calibri" w:eastAsia="Calibri" w:hAnsi="Calibri"/>
+          <w:b/>
+          <w:bCs/>
+          <w:color w:val="049DD9"/>
+          <w:sz w:val="30"/>
+          <w:szCs w:val="30"/>
+        </w:rPr>
+        <w:t xml:space="preserve">2.4 SERVIÇO DE PRAIA</w:t>
+      </w:r>
+    </w:p>
+    <w:p>
+      <w:pPr>
+        <w:spacing w:after="120" w:line="300"/>
+      </w:pPr>
+      <w:r>
+        <w:rPr>
+          <w:rFonts w:ascii="Calibri" w:cs="Calibri" w:eastAsia="Calibri" w:hAnsi="Calibri"/>
+          <w:color w:val="1A1A1A"/>
+          <w:sz w:val="21"/>
+          <w:szCs w:val="21"/>
+        </w:rPr>
+        <w:t xml:space="preserve">Montado </w:t>
+      </w:r>
+      <w:r>
+        <w:rPr>
+          <w:rFonts w:ascii="Calibri" w:cs="Calibri" w:eastAsia="Calibri" w:hAnsi="Calibri"/>
+          <w:b/>
+          <w:bCs/>
+          <w:color w:val="1A1A1A"/>
+          <w:sz w:val="21"/>
+          <w:szCs w:val="21"/>
+        </w:rPr>
+        <w:t xml:space="preserve">todas as manhãs</w:t>
+      </w:r>
+      <w:r>
+        <w:rPr>
+          <w:rFonts w:ascii="Calibri" w:cs="Calibri" w:eastAsia="Calibri" w:hAnsi="Calibri"/>
+          <w:color w:val="1A1A1A"/>
+          <w:sz w:val="21"/>
+          <w:szCs w:val="21"/>
+        </w:rPr>
+        <w:t xml:space="preserve">, e composto por:</w:t>
+      </w:r>
+    </w:p>
+    <w:p>
+      <w:pPr>
+        <w:pStyle w:val="ListParagraph"/>
+        <w:numPr>
+          <w:ilvl w:val="0"/>
+          <w:numId w:val="2"/>
+        </w:numPr>
+        <w:spacing w:after="60" w:line="290"/>
+      </w:pPr>
+      <w:r>
+        <w:rPr>
+          <w:rFonts w:ascii="Calibri" w:cs="Calibri" w:eastAsia="Calibri" w:hAnsi="Calibri"/>
+          <w:b/>
+          <w:bCs/>
+          <w:color w:val="1A1A1A"/>
+          <w:sz w:val="21"/>
+          <w:szCs w:val="21"/>
+        </w:rPr>
+        <w:t xml:space="preserve">Ombrelone de 2,50m</w:t>
+      </w:r>
+    </w:p>
+    <w:p>
+      <w:pPr>
+        <w:pStyle w:val="ListParagraph"/>
+        <w:numPr>
+          <w:ilvl w:val="0"/>
+          <w:numId w:val="2"/>
+        </w:numPr>
+        <w:spacing w:after="60" w:line="290"/>
+      </w:pPr>
+      <w:r>
+        <w:rPr>
+          <w:rFonts w:ascii="Calibri" w:cs="Calibri" w:eastAsia="Calibri" w:hAnsi="Calibri"/>
+          <w:b/>
+          <w:bCs/>
+          <w:color w:val="1A1A1A"/>
+          <w:sz w:val="21"/>
+          <w:szCs w:val="21"/>
+        </w:rPr>
+        <w:t xml:space="preserve">Cadeiras</w:t>
+      </w:r>
+    </w:p>
+    <w:p>
+      <w:pPr>
+        <w:pStyle w:val="ListParagraph"/>
+        <w:numPr>
+          <w:ilvl w:val="0"/>
+          <w:numId w:val="2"/>
+        </w:numPr>
+        <w:spacing w:after="60" w:line="290"/>
+      </w:pPr>
+      <w:r>
+        <w:rPr>
+          <w:rFonts w:ascii="Calibri" w:cs="Calibri" w:eastAsia="Calibri" w:hAnsi="Calibri"/>
+          <w:b/>
+          <w:bCs/>
+          <w:color w:val="1A1A1A"/>
+          <w:sz w:val="21"/>
+          <w:szCs w:val="21"/>
+        </w:rPr>
+        <w:t xml:space="preserve">Espreguiçadeira</w:t>
+      </w:r>
+    </w:p>
+    <w:p>
+      <w:pPr>
+        <w:pStyle w:val="ListParagraph"/>
+        <w:numPr>
+          <w:ilvl w:val="0"/>
+          <w:numId w:val="2"/>
+        </w:numPr>
+        <w:spacing w:after="60" w:line="290"/>
+      </w:pPr>
+      <w:r>
+        <w:rPr>
+          <w:rFonts w:ascii="Calibri" w:cs="Calibri" w:eastAsia="Calibri" w:hAnsi="Calibri"/>
+          <w:b/>
+          <w:bCs/>
+          <w:color w:val="1A1A1A"/>
+          <w:sz w:val="21"/>
+          <w:szCs w:val="21"/>
+        </w:rPr>
+        <w:t xml:space="preserve">Mesinha</w:t>
+      </w:r>
+    </w:p>
+    <w:p>
+      <w:pPr>
+        <w:pStyle w:val="ListParagraph"/>
+        <w:numPr>
+          <w:ilvl w:val="0"/>
+          <w:numId w:val="2"/>
+        </w:numPr>
+        <w:spacing w:after="60" w:line="290"/>
+      </w:pPr>
+      <w:r>
+        <w:rPr>
+          <w:rFonts w:ascii="Calibri" w:cs="Calibri" w:eastAsia="Calibri" w:hAnsi="Calibri"/>
+          <w:color w:val="1A1A1A"/>
+          <w:sz w:val="21"/>
+          <w:szCs w:val="21"/>
+        </w:rPr>
+        <w:t xml:space="preserve">Atendimento de bebidas e porções na areia, </w:t>
+      </w:r>
+      <w:r>
+        <w:rPr>
+          <w:rFonts w:ascii="Calibri" w:cs="Calibri" w:eastAsia="Calibri" w:hAnsi="Calibri"/>
+          <w:b/>
+          <w:bCs/>
+          <w:color w:val="1A1A1A"/>
+          <w:sz w:val="21"/>
+          <w:szCs w:val="21"/>
+        </w:rPr>
+        <w:t xml:space="preserve">sem taxa de serviço</w:t>
+      </w:r>
+    </w:p>
+    <w:p>
+      <w:pPr>
+        <w:pBdr>
+          <w:left w:val="single" w:color="04B2D9" w:sz="18" w:space="14"/>
+        </w:pBdr>
+        <w:spacing w:after="200" w:before="160" w:line="320"/>
+        <w:ind w:left="460"/>
+      </w:pPr>
+      <w:r>
+        <w:rPr>
+          <w:rFonts w:ascii="Calibri" w:cs="Calibri" w:eastAsia="Calibri" w:hAnsi="Calibri"/>
+          <w:b/>
+          <w:bCs/>
+          <w:i w:val="false"/>
+          <w:iCs w:val="false"/>
+          <w:color w:val="0E3740"/>
+          <w:sz w:val="22"/>
+          <w:szCs w:val="22"/>
+        </w:rPr>
+        <w:t xml:space="preserve">O serviço de praia é incluso na diária.</w:t>
+      </w:r>
+      <w:r>
+        <w:rPr>
+          <w:rFonts w:ascii="Calibri" w:cs="Calibri" w:eastAsia="Calibri" w:hAnsi="Calibri"/>
+          <w:i w:val="false"/>
+          <w:iCs w:val="false"/>
+          <w:color w:val="2C3E44"/>
+          <w:sz w:val="22"/>
+          <w:szCs w:val="22"/>
+        </w:rPr>
+        <w:t xml:space="preserve"> Não é extra, não é pacote, não é upgrade. Isso muda como ele se comunica: não é um serviço que a pousada </w:t>
+      </w:r>
+      <w:r>
+        <w:rPr>
+          <w:rFonts w:ascii="Calibri" w:cs="Calibri" w:eastAsia="Calibri" w:hAnsi="Calibri"/>
+          <w:i/>
+          <w:iCs/>
+          <w:color w:val="2C3E44"/>
+          <w:sz w:val="22"/>
+          <w:szCs w:val="22"/>
+        </w:rPr>
+        <w:t xml:space="preserve">oferece</w:t>
+      </w:r>
+      <w:r>
+        <w:rPr>
+          <w:rFonts w:ascii="Calibri" w:cs="Calibri" w:eastAsia="Calibri" w:hAnsi="Calibri"/>
+          <w:i w:val="false"/>
+          <w:iCs w:val="false"/>
+          <w:color w:val="2C3E44"/>
+          <w:sz w:val="22"/>
+          <w:szCs w:val="22"/>
+        </w:rPr>
+        <w:t xml:space="preserve"> — é uma coisa que já está montada quando o hóspede desce. Escreva sempre no já-feito, nunca no disponível: </w:t>
+      </w:r>
+      <w:r>
+        <w:rPr>
+          <w:rFonts w:ascii="Calibri" w:cs="Calibri" w:eastAsia="Calibri" w:hAnsi="Calibri"/>
+          <w:i/>
+          <w:iCs/>
+          <w:color w:val="2C3E44"/>
+          <w:sz w:val="22"/>
+          <w:szCs w:val="22"/>
+        </w:rPr>
+        <w:t xml:space="preserve">"às onze a sombra está onde precisava estar"</w:t>
+      </w:r>
+      <w:r>
+        <w:rPr>
+          <w:rFonts w:ascii="Calibri" w:cs="Calibri" w:eastAsia="Calibri" w:hAnsi="Calibri"/>
+          <w:i w:val="false"/>
+          <w:iCs w:val="false"/>
+          <w:color w:val="2C3E44"/>
+          <w:sz w:val="22"/>
+          <w:szCs w:val="22"/>
+        </w:rPr>
+        <w:t xml:space="preserve">, não </w:t>
+      </w:r>
+      <w:r>
+        <w:rPr>
+          <w:rFonts w:ascii="Calibri" w:cs="Calibri" w:eastAsia="Calibri" w:hAnsi="Calibri"/>
+          <w:i/>
+          <w:iCs/>
+          <w:color w:val="2C3E44"/>
+          <w:sz w:val="22"/>
+          <w:szCs w:val="22"/>
+        </w:rPr>
+        <w:t xml:space="preserve">"oferecemos serviço de praia"</w:t>
+      </w:r>
+      <w:r>
+        <w:rPr>
+          <w:rFonts w:ascii="Calibri" w:cs="Calibri" w:eastAsia="Calibri" w:hAnsi="Calibri"/>
+          <w:i w:val="false"/>
+          <w:iCs w:val="false"/>
+          <w:color w:val="2C3E44"/>
+          <w:sz w:val="22"/>
+          <w:szCs w:val="22"/>
+        </w:rPr>
+        <w:t xml:space="preserve">.</w:t>
+      </w:r>
+    </w:p>
+    <w:p>
+      <w:pPr>
+        <w:keepNext/>
+        <w:spacing w:after="200" w:before="360"/>
+      </w:pPr>
+      <w:r>
+        <w:rPr>
+          <w:rFonts w:ascii="Calibri" w:cs="Calibri" w:eastAsia="Calibri" w:hAnsi="Calibri"/>
+          <w:b/>
+          <w:bCs/>
+          <w:color w:val="049DD9"/>
+          <w:sz w:val="30"/>
+          <w:szCs w:val="30"/>
+        </w:rPr>
+        <w:t xml:space="preserve">2.5 ÁREAS COMUNS</w:t>
+      </w:r>
+    </w:p>
+    <w:p>
+      <w:pPr>
+        <w:pStyle w:val="ListParagraph"/>
+        <w:numPr>
+          <w:ilvl w:val="0"/>
+          <w:numId w:val="2"/>
+        </w:numPr>
+        <w:spacing w:after="60" w:line="290"/>
+      </w:pPr>
+      <w:r>
+        <w:rPr>
+          <w:rFonts w:ascii="Calibri" w:cs="Calibri" w:eastAsia="Calibri" w:hAnsi="Calibri"/>
+          <w:b/>
+          <w:bCs/>
+          <w:color w:val="1A1A1A"/>
+          <w:sz w:val="21"/>
+          <w:szCs w:val="21"/>
+        </w:rPr>
+        <w:t xml:space="preserve">Piscina climatizada</w:t>
+      </w:r>
+      <w:r>
+        <w:rPr>
+          <w:rFonts w:ascii="Calibri" w:cs="Calibri" w:eastAsia="Calibri" w:hAnsi="Calibri"/>
+          <w:color w:val="1A1A1A"/>
+          <w:sz w:val="21"/>
+          <w:szCs w:val="21"/>
+        </w:rPr>
+        <w:t xml:space="preserve"> — funciona o ano inteiro; é o diferencial de baixa temporada.</w:t>
+      </w:r>
+    </w:p>
+    <w:p>
+      <w:pPr>
+        <w:pStyle w:val="ListParagraph"/>
+        <w:numPr>
+          <w:ilvl w:val="0"/>
+          <w:numId w:val="2"/>
+        </w:numPr>
+        <w:spacing w:after="60" w:line="290"/>
+      </w:pPr>
+      <w:r>
+        <w:rPr>
+          <w:rFonts w:ascii="Calibri" w:cs="Calibri" w:eastAsia="Calibri" w:hAnsi="Calibri"/>
+          <w:b/>
+          <w:bCs/>
+          <w:color w:val="1A1A1A"/>
+          <w:sz w:val="21"/>
+          <w:szCs w:val="21"/>
+        </w:rPr>
+        <w:t xml:space="preserve">Salão multifuncional</w:t>
+      </w:r>
+      <w:r>
+        <w:rPr>
+          <w:rFonts w:ascii="Calibri" w:cs="Calibri" w:eastAsia="Calibri" w:hAnsi="Calibri"/>
+          <w:color w:val="1A1A1A"/>
+          <w:sz w:val="21"/>
+          <w:szCs w:val="21"/>
+        </w:rPr>
+        <w:t xml:space="preserve"> com </w:t>
+      </w:r>
+      <w:r>
+        <w:rPr>
+          <w:rFonts w:ascii="Calibri" w:cs="Calibri" w:eastAsia="Calibri" w:hAnsi="Calibri"/>
+          <w:b/>
+          <w:bCs/>
+          <w:color w:val="1A1A1A"/>
+          <w:sz w:val="21"/>
+          <w:szCs w:val="21"/>
+        </w:rPr>
+        <w:t xml:space="preserve">monitor de 82 polegadas</w:t>
+      </w:r>
+      <w:r>
+        <w:rPr>
+          <w:rFonts w:ascii="Calibri" w:cs="Calibri" w:eastAsia="Calibri" w:hAnsi="Calibri"/>
+          <w:color w:val="1A1A1A"/>
+          <w:sz w:val="21"/>
+          <w:szCs w:val="21"/>
+        </w:rPr>
+        <w:t xml:space="preserve"> — reuniões, pequenos eventos, confraternizações, dia de chuva, retiros e famílias grandes.</w:t>
+      </w:r>
+    </w:p>
+    <w:p>
+      <w:pPr>
+        <w:keepNext/>
+        <w:spacing w:after="200" w:before="360"/>
+      </w:pPr>
+      <w:r>
+        <w:rPr>
+          <w:rFonts w:ascii="Calibri" w:cs="Calibri" w:eastAsia="Calibri" w:hAnsi="Calibri"/>
+          <w:b/>
+          <w:bCs/>
+          <w:color w:val="049DD9"/>
+          <w:sz w:val="30"/>
+          <w:szCs w:val="30"/>
+        </w:rPr>
+        <w:t xml:space="preserve">2.6 INFRAESTRUTURA INVISÍVEL</w:t>
+      </w:r>
+    </w:p>
+    <w:p>
+      <w:pPr>
+        <w:pStyle w:val="ListParagraph"/>
+        <w:numPr>
+          <w:ilvl w:val="0"/>
+          <w:numId w:val="2"/>
+        </w:numPr>
+        <w:spacing w:after="60" w:line="290"/>
+      </w:pPr>
+      <w:r>
+        <w:rPr>
+          <w:rFonts w:ascii="Calibri" w:cs="Calibri" w:eastAsia="Calibri" w:hAnsi="Calibri"/>
+          <w:b/>
+          <w:bCs/>
+          <w:color w:val="1A1A1A"/>
+          <w:sz w:val="21"/>
+          <w:szCs w:val="21"/>
+        </w:rPr>
+        <w:t xml:space="preserve">Gerador próprio</w:t>
+      </w:r>
+      <w:r>
+        <w:rPr>
+          <w:rFonts w:ascii="Calibri" w:cs="Calibri" w:eastAsia="Calibri" w:hAnsi="Calibri"/>
+          <w:color w:val="1A1A1A"/>
+          <w:sz w:val="21"/>
+          <w:szCs w:val="21"/>
+        </w:rPr>
+        <w:t xml:space="preserve"> que sustenta </w:t>
+      </w:r>
+      <w:r>
+        <w:rPr>
+          <w:rFonts w:ascii="Calibri" w:cs="Calibri" w:eastAsia="Calibri" w:hAnsi="Calibri"/>
+          <w:b/>
+          <w:bCs/>
+          <w:color w:val="1A1A1A"/>
+          <w:sz w:val="21"/>
+          <w:szCs w:val="21"/>
+        </w:rPr>
+        <w:t xml:space="preserve">a pousada inteira</w:t>
+      </w:r>
+      <w:r>
+        <w:rPr>
+          <w:rFonts w:ascii="Calibri" w:cs="Calibri" w:eastAsia="Calibri" w:hAnsi="Calibri"/>
+          <w:color w:val="1A1A1A"/>
+          <w:sz w:val="21"/>
+          <w:szCs w:val="21"/>
+        </w:rPr>
+        <w:t xml:space="preserve"> — a operação não para em queda de energia.</w:t>
+      </w:r>
+    </w:p>
+    <w:p>
+      <w:pPr>
+        <w:pStyle w:val="ListParagraph"/>
+        <w:numPr>
+          <w:ilvl w:val="0"/>
+          <w:numId w:val="2"/>
+        </w:numPr>
+        <w:spacing w:after="60" w:line="290"/>
+      </w:pPr>
+      <w:r>
+        <w:rPr>
+          <w:rFonts w:ascii="Calibri" w:cs="Calibri" w:eastAsia="Calibri" w:hAnsi="Calibri"/>
+          <w:b/>
+          <w:bCs/>
+          <w:color w:val="1A1A1A"/>
+          <w:sz w:val="21"/>
+          <w:szCs w:val="21"/>
+        </w:rPr>
+        <w:t xml:space="preserve">Placas fotovoltaicas</w:t>
+      </w:r>
+      <w:r>
+        <w:rPr>
+          <w:rFonts w:ascii="Calibri" w:cs="Calibri" w:eastAsia="Calibri" w:hAnsi="Calibri"/>
+          <w:color w:val="1A1A1A"/>
+          <w:sz w:val="21"/>
+          <w:szCs w:val="21"/>
+        </w:rPr>
+        <w:t xml:space="preserve"> — parte da operação sustentável.</w:t>
+      </w:r>
+    </w:p>
+    <w:p>
+      <w:pPr>
+        <w:pBdr>
+          <w:left w:val="single" w:color="04B2D9" w:sz="18" w:space="14"/>
+        </w:pBdr>
+        <w:spacing w:after="200" w:before="160" w:line="320"/>
+        <w:ind w:left="460"/>
+      </w:pPr>
+      <w:r>
+        <w:rPr>
+          <w:rFonts w:ascii="Calibri" w:cs="Calibri" w:eastAsia="Calibri" w:hAnsi="Calibri"/>
+          <w:i w:val="false"/>
+          <w:iCs w:val="false"/>
+          <w:color w:val="2C3E44"/>
+          <w:sz w:val="22"/>
+          <w:szCs w:val="22"/>
+        </w:rPr>
+        <w:t xml:space="preserve">Este é o item mais subaproveitado da marca. Gerador e energia solar </w:t>
+      </w:r>
+      <w:r>
+        <w:rPr>
+          <w:rFonts w:ascii="Calibri" w:cs="Calibri" w:eastAsia="Calibri" w:hAnsi="Calibri"/>
+          <w:b/>
+          <w:bCs/>
+          <w:i w:val="false"/>
+          <w:iCs w:val="false"/>
+          <w:color w:val="0E3740"/>
+          <w:sz w:val="22"/>
+          <w:szCs w:val="22"/>
+        </w:rPr>
+        <w:t xml:space="preserve">são</w:t>
+      </w:r>
+      <w:r>
+        <w:rPr>
+          <w:rFonts w:ascii="Calibri" w:cs="Calibri" w:eastAsia="Calibri" w:hAnsi="Calibri"/>
+          <w:i w:val="false"/>
+          <w:iCs w:val="false"/>
+          <w:color w:val="2C3E44"/>
+          <w:sz w:val="22"/>
+          <w:szCs w:val="22"/>
+        </w:rPr>
+        <w:t xml:space="preserve"> o conceito-âncora em forma de equipamento: o hóspede só percebe quando a rua inteira apaga e aqui não acontece nada.</w:t>
+      </w:r>
+    </w:p>
+    <w:p>
+      <w:pPr>
+        <w:keepNext/>
+        <w:spacing w:after="200" w:before="360"/>
+      </w:pPr>
+      <w:r>
+        <w:rPr>
+          <w:rFonts w:ascii="Calibri" w:cs="Calibri" w:eastAsia="Calibri" w:hAnsi="Calibri"/>
+          <w:b/>
+          <w:bCs/>
+          <w:color w:val="049DD9"/>
+          <w:sz w:val="30"/>
+          <w:szCs w:val="30"/>
+        </w:rPr>
+        <w:t xml:space="preserve">2.7 LOCALIZAÇÃO</w:t>
+      </w:r>
+    </w:p>
+    <w:p>
+      <w:pPr>
+        <w:pStyle w:val="ListParagraph"/>
+        <w:numPr>
+          <w:ilvl w:val="0"/>
+          <w:numId w:val="2"/>
+        </w:numPr>
+        <w:spacing w:after="60" w:line="290"/>
+      </w:pPr>
+      <w:r>
+        <w:rPr>
+          <w:rFonts w:ascii="Calibri" w:cs="Calibri" w:eastAsia="Calibri" w:hAnsi="Calibri"/>
+          <w:b/>
+          <w:bCs/>
+          <w:color w:val="1A1A1A"/>
+          <w:sz w:val="21"/>
+          <w:szCs w:val="21"/>
+        </w:rPr>
+        <w:t xml:space="preserve">170 metros da praia</w:t>
+      </w:r>
+    </w:p>
+    <w:p>
+      <w:pPr>
+        <w:pStyle w:val="ListParagraph"/>
+        <w:numPr>
+          <w:ilvl w:val="0"/>
+          <w:numId w:val="2"/>
+        </w:numPr>
+        <w:spacing w:after="60" w:line="290"/>
+      </w:pPr>
+      <w:r>
+        <w:rPr>
+          <w:rFonts w:ascii="Calibri" w:cs="Calibri" w:eastAsia="Calibri" w:hAnsi="Calibri"/>
+          <w:b/>
+          <w:bCs/>
+          <w:color w:val="1A1A1A"/>
+          <w:sz w:val="21"/>
+          <w:szCs w:val="21"/>
+        </w:rPr>
+        <w:t xml:space="preserve">≈ 400 metros do centrinho de Camburi</w:t>
+      </w:r>
+    </w:p>
+    <w:p>
+      <w:pPr>
+        <w:pStyle w:val="ListParagraph"/>
+        <w:numPr>
+          <w:ilvl w:val="0"/>
+          <w:numId w:val="2"/>
+        </w:numPr>
+        <w:spacing w:after="60" w:line="290"/>
+      </w:pPr>
+      <w:r>
+        <w:rPr>
+          <w:rFonts w:ascii="Calibri" w:cs="Calibri" w:eastAsia="Calibri" w:hAnsi="Calibri"/>
+          <w:color w:val="1A1A1A"/>
+          <w:sz w:val="21"/>
+          <w:szCs w:val="21"/>
+        </w:rPr>
+        <w:t xml:space="preserve">≈ 2h30 da capital paulista</w:t>
+      </w:r>
+    </w:p>
+    <w:p>
+      <w:pPr>
+        <w:keepNext/>
+        <w:spacing w:after="200" w:before="360"/>
+      </w:pPr>
+      <w:r>
+        <w:rPr>
+          <w:rFonts w:ascii="Calibri" w:cs="Calibri" w:eastAsia="Calibri" w:hAnsi="Calibri"/>
+          <w:b/>
+          <w:bCs/>
+          <w:color w:val="049DD9"/>
+          <w:sz w:val="30"/>
+          <w:szCs w:val="30"/>
+        </w:rPr>
+        <w:t xml:space="preserve">2.8 CORTESIAS PERMANENTES</w:t>
+      </w:r>
+    </w:p>
+    <w:p>
+      <w:pPr>
+        <w:pStyle w:val="ListParagraph"/>
+        <w:numPr>
+          <w:ilvl w:val="0"/>
+          <w:numId w:val="2"/>
+        </w:numPr>
+        <w:spacing w:after="60" w:line="290"/>
+      </w:pPr>
+      <w:r>
+        <w:rPr>
+          <w:rFonts w:ascii="Calibri" w:cs="Calibri" w:eastAsia="Calibri" w:hAnsi="Calibri"/>
+          <w:b/>
+          <w:bCs/>
+          <w:color w:val="1A1A1A"/>
+          <w:sz w:val="21"/>
+          <w:szCs w:val="21"/>
+        </w:rPr>
+        <w:t xml:space="preserve">Café expresso, chá e fruta</w:t>
+      </w:r>
+      <w:r>
+        <w:rPr>
+          <w:rFonts w:ascii="Calibri" w:cs="Calibri" w:eastAsia="Calibri" w:hAnsi="Calibri"/>
+          <w:color w:val="1A1A1A"/>
+          <w:sz w:val="21"/>
+          <w:szCs w:val="21"/>
+        </w:rPr>
+        <w:t xml:space="preserve"> — sempre disponíveis, o dia todo, sem cobrança.</w:t>
+      </w:r>
+    </w:p>
+    <w:p>
+      <w:pPr>
+        <w:pStyle w:val="ListParagraph"/>
+        <w:numPr>
+          <w:ilvl w:val="0"/>
+          <w:numId w:val="2"/>
+        </w:numPr>
+        <w:spacing w:after="60" w:line="290"/>
+      </w:pPr>
+      <w:r>
+        <w:rPr>
+          <w:rFonts w:ascii="Calibri" w:cs="Calibri" w:eastAsia="Calibri" w:hAnsi="Calibri"/>
+          <w:b/>
+          <w:bCs/>
+          <w:color w:val="1A1A1A"/>
+          <w:sz w:val="21"/>
+          <w:szCs w:val="21"/>
+        </w:rPr>
+        <w:t xml:space="preserve">Kit amenities completo.</w:t>
+      </w:r>
+    </w:p>
+    <w:p>
+      <w:pPr>
+        <w:pStyle w:val="ListParagraph"/>
+        <w:numPr>
+          <w:ilvl w:val="0"/>
+          <w:numId w:val="2"/>
+        </w:numPr>
+        <w:spacing w:after="60" w:line="290"/>
+      </w:pPr>
+      <w:r>
+        <w:rPr>
+          <w:rFonts w:ascii="Calibri" w:cs="Calibri" w:eastAsia="Calibri" w:hAnsi="Calibri"/>
+          <w:b/>
+          <w:bCs/>
+          <w:color w:val="1A1A1A"/>
+          <w:sz w:val="21"/>
+          <w:szCs w:val="21"/>
+        </w:rPr>
+        <w:t xml:space="preserve">Check-in antecipado para todos</w:t>
+      </w:r>
+      <w:r>
+        <w:rPr>
+          <w:rFonts w:ascii="Calibri" w:cs="Calibri" w:eastAsia="Calibri" w:hAnsi="Calibri"/>
+          <w:color w:val="1A1A1A"/>
+          <w:sz w:val="21"/>
+          <w:szCs w:val="21"/>
+        </w:rPr>
+        <w:t xml:space="preserve">, quando houver disponibilidade.</w:t>
+      </w:r>
+    </w:p>
+    <w:p>
+      <w:pPr>
+        <w:pStyle w:val="ListParagraph"/>
+        <w:numPr>
+          <w:ilvl w:val="0"/>
+          <w:numId w:val="2"/>
+        </w:numPr>
+        <w:spacing w:after="60" w:line="290"/>
+      </w:pPr>
+      <w:r>
+        <w:rPr>
+          <w:rFonts w:ascii="Calibri" w:cs="Calibri" w:eastAsia="Calibri" w:hAnsi="Calibri"/>
+          <w:b/>
+          <w:bCs/>
+          <w:color w:val="1A1A1A"/>
+          <w:sz w:val="21"/>
+          <w:szCs w:val="21"/>
+        </w:rPr>
+        <w:t xml:space="preserve">Sugestões personalizadas</w:t>
+      </w:r>
+      <w:r>
+        <w:rPr>
+          <w:rFonts w:ascii="Calibri" w:cs="Calibri" w:eastAsia="Calibri" w:hAnsi="Calibri"/>
+          <w:color w:val="1A1A1A"/>
+          <w:sz w:val="21"/>
+          <w:szCs w:val="21"/>
+        </w:rPr>
+        <w:t xml:space="preserve"> de atividades, roteiros e restaurantes.</w:t>
+      </w:r>
+    </w:p>
+    <w:p>
+      <w:pPr>
+        <w:keepNext/>
+        <w:spacing w:after="200" w:before="360"/>
+      </w:pPr>
+      <w:r>
+        <w:rPr>
+          <w:rFonts w:ascii="Calibri" w:cs="Calibri" w:eastAsia="Calibri" w:hAnsi="Calibri"/>
+          <w:b/>
+          <w:bCs/>
+          <w:color w:val="049DD9"/>
+          <w:sz w:val="30"/>
+          <w:szCs w:val="30"/>
+        </w:rPr>
+        <w:t xml:space="preserve">2.9 DE FATO A HISTÓRIA — tabela de tradução</w:t>
+      </w:r>
+    </w:p>
+    <w:p>
+      <w:pPr>
+        <w:spacing w:after="120" w:line="300"/>
+      </w:pPr>
+      <w:r>
+        <w:rPr>
+          <w:rFonts w:ascii="Calibri" w:cs="Calibri" w:eastAsia="Calibri" w:hAnsi="Calibri"/>
+          <w:i/>
+          <w:iCs/>
+          <w:color w:val="1A1A1A"/>
+          <w:sz w:val="21"/>
+          <w:szCs w:val="21"/>
+        </w:rPr>
+        <w:t xml:space="preserve">Como cada fato vira conteúdo sem virar folheto.</w:t>
+      </w:r>
+    </w:p>
+    <w:tbl>
+      <w:tblPr>
+        <w:tblW w:type="dxa" w:w="9026"/>
+        <w:tblBorders>
+          <w:top w:val="single" w:color="FFFFFF" w:sz="2"/>
+          <w:left w:val="single" w:color="FFFFFF" w:sz="2"/>
+          <w:bottom w:val="single" w:color="FFFFFF" w:sz="2"/>
+          <w:right w:val="single" w:color="FFFFFF" w:sz="2"/>
+          <w:insideH w:val="single" w:color="FFFFFF" w:sz="2"/>
+          <w:insideV w:val="single" w:color="FFFFFF" w:sz="2"/>
+        </w:tblBorders>
+      </w:tblPr>
+      <w:tblGrid>
+        <w:gridCol w:w="4513"/>
+        <w:gridCol w:w="4513"/>
+      </w:tblGrid>
+      <w:tr>
+        <w:trPr>
+          <w:tblHeader/>
+        </w:trPr>
+        <w:tc>
+          <w:tcPr>
+            <w:tcW w:type="dxa" w:w="4513"/>
+            <w:shd w:fill="0E3740" w:color="auto" w:val="clear"/>
+            <w:tcMar>
+              <w:top w:type="dxa" w:w="80"/>
+              <w:left w:type="dxa" w:w="120"/>
+              <w:bottom w:type="dxa" w:w="80"/>
+              <w:right w:type="dxa" w:w="120"/>
+            </w:tcMar>
+          </w:tcPr>
+          <w:p>
+            <w:pPr>
+              <w:spacing w:after="0" w:line="260"/>
+            </w:pPr>
+            <w:r>
+              <w:rPr>
+                <w:rFonts w:ascii="Calibri" w:cs="Calibri" w:eastAsia="Calibri" w:hAnsi="Calibri"/>
+                <w:b/>
+                <w:bCs/>
+                <w:color w:val="FFFFFF"/>
+                <w:sz w:val="19"/>
+                <w:szCs w:val="19"/>
+              </w:rPr>
+              <w:t xml:space="preserve">Fato operacional</w:t>
+            </w:r>
+          </w:p>
+        </w:tc>
+        <w:tc>
+          <w:tcPr>
+            <w:tcW w:type="dxa" w:w="4513"/>
+            <w:shd w:fill="0E3740" w:color="auto" w:val="clear"/>
+            <w:tcMar>
+              <w:top w:type="dxa" w:w="80"/>
+              <w:left w:type="dxa" w:w="120"/>
+              <w:bottom w:type="dxa" w:w="80"/>
+              <w:right w:type="dxa" w:w="120"/>
+            </w:tcMar>
+          </w:tcPr>
+          <w:p>
+            <w:pPr>
+              <w:spacing w:after="0" w:line="260"/>
+            </w:pPr>
+            <w:r>
+              <w:rPr>
+                <w:rFonts w:ascii="Calibri" w:cs="Calibri" w:eastAsia="Calibri" w:hAnsi="Calibri"/>
+                <w:b/>
+                <w:bCs/>
+                <w:color w:val="FFFFFF"/>
+                <w:sz w:val="19"/>
+                <w:szCs w:val="19"/>
+              </w:rPr>
+              <w:t xml:space="preserve">Como se conta</w:t>
+            </w:r>
+          </w:p>
+        </w:tc>
+      </w:tr>
+      <w:tr>
+        <w:tc>
+          <w:tcPr>
+            <w:tcW w:type="dxa" w:w="4513"/>
+            <w:shd w:fill="F2F2F2" w:color="auto" w:val="clear"/>
+            <w:tcMar>
+              <w:top w:type="dxa" w:w="80"/>
+              <w:left w:type="dxa" w:w="120"/>
+              <w:bottom w:type="dxa" w:w="80"/>
+              <w:right w:type="dxa" w:w="120"/>
+            </w:tcMar>
+          </w:tcPr>
+          <w:p>
+            <w:pPr>
+              <w:spacing w:after="0" w:line="260"/>
+            </w:pPr>
+            <w:r>
+              <w:rPr>
+                <w:rFonts w:ascii="Calibri" w:cs="Calibri" w:eastAsia="Calibri" w:hAnsi="Calibri"/>
+                <w:b w:val="false"/>
+                <w:bCs w:val="false"/>
+                <w:color w:val="1A1A1A"/>
+                <w:sz w:val="19"/>
+                <w:szCs w:val="19"/>
+              </w:rPr>
+              <w:t xml:space="preserve">18 suítes</w:t>
+            </w:r>
+          </w:p>
+        </w:tc>
+        <w:tc>
+          <w:tcPr>
+            <w:tcW w:type="dxa" w:w="4513"/>
+            <w:shd w:fill="F2F2F2" w:color="auto" w:val="clear"/>
+            <w:tcMar>
+              <w:top w:type="dxa" w:w="80"/>
+              <w:left w:type="dxa" w:w="120"/>
+              <w:bottom w:type="dxa" w:w="80"/>
+              <w:right w:type="dxa" w:w="120"/>
+            </w:tcMar>
+          </w:tcPr>
+          <w:p>
+            <w:pPr>
+              <w:spacing w:after="0" w:line="260"/>
+            </w:pPr>
+            <w:r>
+              <w:rPr>
+                <w:rFonts w:ascii="Calibri" w:cs="Calibri" w:eastAsia="Calibri" w:hAnsi="Calibri"/>
+                <w:b w:val="false"/>
+                <w:bCs w:val="false"/>
+                <w:color w:val="1A1A1A"/>
+                <w:sz w:val="19"/>
+                <w:szCs w:val="19"/>
+              </w:rPr>
               <w:t xml:space="preserve">"Somos dezoito. Dá para lembrar o nome de todo mundo."</w:t>
+            </w:r>
+          </w:p>
+        </w:tc>
+      </w:tr>
+      <w:tr>
+        <w:tc>
+          <w:tcPr>
+            <w:tcW w:type="dxa" w:w="4513"/>
+            <w:shd w:fill="F2F2F2" w:color="auto" w:val="clear"/>
+            <w:tcMar>
+              <w:top w:type="dxa" w:w="80"/>
+              <w:left w:type="dxa" w:w="120"/>
+              <w:bottom w:type="dxa" w:w="80"/>
+              <w:right w:type="dxa" w:w="120"/>
+            </w:tcMar>
+          </w:tcPr>
+          <w:p>
+            <w:pPr>
+              <w:spacing w:after="0" w:line="260"/>
+            </w:pPr>
+            <w:r>
+              <w:rPr>
+                <w:rFonts w:ascii="Calibri" w:cs="Calibri" w:eastAsia="Calibri" w:hAnsi="Calibri"/>
+                <w:b w:val="false"/>
+                <w:bCs w:val="false"/>
+                <w:color w:val="1A1A1A"/>
+                <w:sz w:val="19"/>
+                <w:szCs w:val="19"/>
+              </w:rPr>
+              <w:t xml:space="preserve">3 suítes com varanda</w:t>
+            </w:r>
+          </w:p>
+        </w:tc>
+        <w:tc>
+          <w:tcPr>
+            <w:tcW w:type="dxa" w:w="4513"/>
+            <w:shd w:fill="F2F2F2" w:color="auto" w:val="clear"/>
+            <w:tcMar>
+              <w:top w:type="dxa" w:w="80"/>
+              <w:left w:type="dxa" w:w="120"/>
+              <w:bottom w:type="dxa" w:w="80"/>
+              <w:right w:type="dxa" w:w="120"/>
+            </w:tcMar>
+          </w:tcPr>
+          <w:p>
+            <w:pPr>
+              <w:spacing w:after="0" w:line="260"/>
+            </w:pPr>
+            <w:r>
+              <w:rPr>
+                <w:rFonts w:ascii="Calibri" w:cs="Calibri" w:eastAsia="Calibri" w:hAnsi="Calibri"/>
+                <w:b w:val="false"/>
+                <w:bCs w:val="false"/>
+                <w:color w:val="1A1A1A"/>
+                <w:sz w:val="19"/>
+                <w:szCs w:val="19"/>
+              </w:rPr>
+              <w:t xml:space="preserve">"Três das dezoito têm varanda. Quem já veio sabe qual pedir."</w:t>
+            </w:r>
+          </w:p>
+        </w:tc>
+      </w:tr>
+      <w:tr>
+        <w:tc>
+          <w:tcPr>
+            <w:tcW w:type="dxa" w:w="4513"/>
+            <w:shd w:fill="F2F2F2" w:color="auto" w:val="clear"/>
+            <w:tcMar>
+              <w:top w:type="dxa" w:w="80"/>
+              <w:left w:type="dxa" w:w="120"/>
+              <w:bottom w:type="dxa" w:w="80"/>
+              <w:right w:type="dxa" w:w="120"/>
+            </w:tcMar>
+          </w:tcPr>
+          <w:p>
+            <w:pPr>
+              <w:spacing w:after="0" w:line="260"/>
+            </w:pPr>
+            <w:r>
+              <w:rPr>
+                <w:rFonts w:ascii="Calibri" w:cs="Calibri" w:eastAsia="Calibri" w:hAnsi="Calibri"/>
+                <w:b w:val="false"/>
+                <w:bCs w:val="false"/>
+                <w:color w:val="1A1A1A"/>
+                <w:sz w:val="19"/>
+                <w:szCs w:val="19"/>
+              </w:rPr>
+              <w:t xml:space="preserve">11 duplos, 5 triplos, 2 quádruplos</w:t>
+            </w:r>
+          </w:p>
+        </w:tc>
+        <w:tc>
+          <w:tcPr>
+            <w:tcW w:type="dxa" w:w="4513"/>
+            <w:shd w:fill="F2F2F2" w:color="auto" w:val="clear"/>
+            <w:tcMar>
+              <w:top w:type="dxa" w:w="80"/>
+              <w:left w:type="dxa" w:w="120"/>
+              <w:bottom w:type="dxa" w:w="80"/>
+              <w:right w:type="dxa" w:w="120"/>
+            </w:tcMar>
+          </w:tcPr>
+          <w:p>
+            <w:pPr>
+              <w:spacing w:after="0" w:line="260"/>
+            </w:pPr>
+            <w:r>
+              <w:rPr>
+                <w:rFonts w:ascii="Calibri" w:cs="Calibri" w:eastAsia="Calibri" w:hAnsi="Calibri"/>
+                <w:b w:val="false"/>
+                <w:bCs w:val="false"/>
+                <w:color w:val="1A1A1A"/>
+                <w:sz w:val="19"/>
+                <w:szCs w:val="19"/>
+              </w:rPr>
+              <w:t xml:space="preserve">"Cabe o casal. Cabe a família inteira. Cabe a avó junto."</w:t>
+            </w:r>
+          </w:p>
+        </w:tc>
+      </w:tr>
+      <w:tr>
+        <w:tc>
+          <w:tcPr>
+            <w:tcW w:type="dxa" w:w="4513"/>
+            <w:shd w:fill="F2F2F2" w:color="auto" w:val="clear"/>
+            <w:tcMar>
+              <w:top w:type="dxa" w:w="80"/>
+              <w:left w:type="dxa" w:w="120"/>
+              <w:bottom w:type="dxa" w:w="80"/>
+              <w:right w:type="dxa" w:w="120"/>
+            </w:tcMar>
+          </w:tcPr>
+          <w:p>
+            <w:pPr>
+              <w:spacing w:after="0" w:line="260"/>
+            </w:pPr>
+            <w:r>
+              <w:rPr>
+                <w:rFonts w:ascii="Calibri" w:cs="Calibri" w:eastAsia="Calibri" w:hAnsi="Calibri"/>
+                <w:b w:val="false"/>
+                <w:bCs w:val="false"/>
+                <w:color w:val="1A1A1A"/>
+                <w:sz w:val="19"/>
+                <w:szCs w:val="19"/>
+              </w:rPr>
+              <w:t xml:space="preserve">Serviço de praia incluso</w:t>
+            </w:r>
+          </w:p>
+        </w:tc>
+        <w:tc>
+          <w:tcPr>
+            <w:tcW w:type="dxa" w:w="4513"/>
+            <w:shd w:fill="F2F2F2" w:color="auto" w:val="clear"/>
+            <w:tcMar>
+              <w:top w:type="dxa" w:w="80"/>
+              <w:left w:type="dxa" w:w="120"/>
+              <w:bottom w:type="dxa" w:w="80"/>
+              <w:right w:type="dxa" w:w="120"/>
+            </w:tcMar>
+          </w:tcPr>
+          <w:p>
+            <w:pPr>
+              <w:spacing w:after="0" w:line="260"/>
+            </w:pPr>
+            <w:r>
+              <w:rPr>
+                <w:rFonts w:ascii="Calibri" w:cs="Calibri" w:eastAsia="Calibri" w:hAnsi="Calibri"/>
+                <w:b w:val="false"/>
+                <w:bCs w:val="false"/>
+                <w:color w:val="1A1A1A"/>
+                <w:sz w:val="19"/>
+                <w:szCs w:val="19"/>
+              </w:rPr>
+              <w:t xml:space="preserve">"Não tem serviço de praia para contratar. Tem serviço de praia montado."</w:t>
+            </w:r>
+          </w:p>
+        </w:tc>
+      </w:tr>
+      <w:tr>
+        <w:tc>
+          <w:tcPr>
+            <w:tcW w:type="dxa" w:w="4513"/>
+            <w:shd w:fill="F2F2F2" w:color="auto" w:val="clear"/>
+            <w:tcMar>
+              <w:top w:type="dxa" w:w="80"/>
+              <w:left w:type="dxa" w:w="120"/>
+              <w:bottom w:type="dxa" w:w="80"/>
+              <w:right w:type="dxa" w:w="120"/>
+            </w:tcMar>
+          </w:tcPr>
+          <w:p>
+            <w:pPr>
+              <w:spacing w:after="0" w:line="260"/>
+            </w:pPr>
+            <w:r>
+              <w:rPr>
+                <w:rFonts w:ascii="Calibri" w:cs="Calibri" w:eastAsia="Calibri" w:hAnsi="Calibri"/>
+                <w:b w:val="false"/>
+                <w:bCs w:val="false"/>
+                <w:color w:val="1A1A1A"/>
+                <w:sz w:val="19"/>
+                <w:szCs w:val="19"/>
+              </w:rPr>
+              <w:t xml:space="preserve">Compra do imóvel em 2015</w:t>
+            </w:r>
+          </w:p>
+        </w:tc>
+        <w:tc>
+          <w:tcPr>
+            <w:tcW w:type="dxa" w:w="4513"/>
+            <w:shd w:fill="F2F2F2" w:color="auto" w:val="clear"/>
+            <w:tcMar>
+              <w:top w:type="dxa" w:w="80"/>
+              <w:left w:type="dxa" w:w="120"/>
+              <w:bottom w:type="dxa" w:w="80"/>
+              <w:right w:type="dxa" w:w="120"/>
+            </w:tcMar>
+          </w:tcPr>
+          <w:p>
+            <w:pPr>
+              <w:spacing w:after="0" w:line="260"/>
+            </w:pPr>
+            <w:r>
+              <w:rPr>
+                <w:rFonts w:ascii="Calibri" w:cs="Calibri" w:eastAsia="Calibri" w:hAnsi="Calibri"/>
+                <w:b w:val="false"/>
+                <w:bCs w:val="false"/>
+                <w:color w:val="1A1A1A"/>
+                <w:sz w:val="19"/>
+                <w:szCs w:val="19"/>
+              </w:rPr>
+              <w:t xml:space="preserve">"Cuidamos desta casa por treze anos antes de ela ser nossa."</w:t>
             </w:r>
           </w:p>
         </w:tc>
@@ -7251,7 +8680,27 @@
           <w:sz w:val="21"/>
           <w:szCs w:val="21"/>
         </w:rPr>
-        <w:t xml:space="preserve">Serviço de praia montado todo dia — ombrelone 2,50m, cadeiras, espreguiçadeira, mesinha</w:t>
+        <w:t xml:space="preserve">Serviço de praia montado todo dia e </w:t>
+      </w:r>
+      <w:r>
+        <w:rPr>
+          <w:rFonts w:ascii="Calibri" w:cs="Calibri" w:eastAsia="Calibri" w:hAnsi="Calibri"/>
+          <w:b/>
+          <w:bCs/>
+          <w:color w:val="1A1A1A"/>
+          <w:sz w:val="21"/>
+          <w:szCs w:val="21"/>
+        </w:rPr>
+        <w:t xml:space="preserve">incluso na diária</w:t>
+      </w:r>
+      <w:r>
+        <w:rPr>
+          <w:rFonts w:ascii="Calibri" w:cs="Calibri" w:eastAsia="Calibri" w:hAnsi="Calibri"/>
+          <w:color w:val="1A1A1A"/>
+          <w:sz w:val="21"/>
+          <w:szCs w:val="21"/>
+        </w:rPr>
+        <w:t xml:space="preserve"> — ombrelone 2,50m, cadeiras, espreguiçadeira, mesinha</w:t>
       </w:r>
     </w:p>
     <w:p>
@@ -13857,7 +15306,7 @@
           <w:sz w:val="25"/>
           <w:szCs w:val="25"/>
         </w:rPr>
-        <w:t xml:space="preserve">Banco de aberturas — 15 primeiras linhas</w:t>
+        <w:t xml:space="preserve">Banco de aberturas — 18 primeiras linhas</w:t>
       </w:r>
     </w:p>
     <w:p>
@@ -14157,6 +15606,63 @@
           <w:szCs w:val="21"/>
         </w:rPr>
         <w:t xml:space="preserve">Alguém acordou antes de você.</w:t>
+      </w:r>
+    </w:p>
+    <w:p>
+      <w:pPr>
+        <w:pStyle w:val="ListParagraph"/>
+        <w:numPr>
+          <w:ilvl w:val="0"/>
+          <w:numId w:val="3"/>
+        </w:numPr>
+        <w:spacing w:after="60" w:line="290"/>
+      </w:pPr>
+      <w:r>
+        <w:rPr>
+          <w:rFonts w:ascii="Calibri" w:cs="Calibri" w:eastAsia="Calibri" w:hAnsi="Calibri"/>
+          <w:color w:val="1A1A1A"/>
+          <w:sz w:val="21"/>
+          <w:szCs w:val="21"/>
+        </w:rPr>
+        <w:t xml:space="preserve">Por treze anos, esta casa não era nossa.</w:t>
+      </w:r>
+    </w:p>
+    <w:p>
+      <w:pPr>
+        <w:pStyle w:val="ListParagraph"/>
+        <w:numPr>
+          <w:ilvl w:val="0"/>
+          <w:numId w:val="3"/>
+        </w:numPr>
+        <w:spacing w:after="60" w:line="290"/>
+      </w:pPr>
+      <w:r>
+        <w:rPr>
+          <w:rFonts w:ascii="Calibri" w:cs="Calibri" w:eastAsia="Calibri" w:hAnsi="Calibri"/>
+          <w:color w:val="1A1A1A"/>
+          <w:sz w:val="21"/>
+          <w:szCs w:val="21"/>
+        </w:rPr>
+        <w:t xml:space="preserve">Três das dezoito têm varanda.</w:t>
+      </w:r>
+    </w:p>
+    <w:p>
+      <w:pPr>
+        <w:pStyle w:val="ListParagraph"/>
+        <w:numPr>
+          <w:ilvl w:val="0"/>
+          <w:numId w:val="3"/>
+        </w:numPr>
+        <w:spacing w:after="60" w:line="290"/>
+      </w:pPr>
+      <w:r>
+        <w:rPr>
+          <w:rFonts w:ascii="Calibri" w:cs="Calibri" w:eastAsia="Calibri" w:hAnsi="Calibri"/>
+          <w:color w:val="1A1A1A"/>
+          <w:sz w:val="21"/>
+          <w:szCs w:val="21"/>
+        </w:rPr>
+        <w:t xml:space="preserve">Não tem serviço de praia para contratar. Tem serviço de praia montado.</w:t>
       </w:r>
     </w:p>
     <w:p>
@@ -14389,7 +15895,7 @@
           <w:sz w:val="30"/>
           <w:szCs w:val="30"/>
         </w:rPr>
-        <w:t xml:space="preserve">4.5 TRINTA PAUTAS PRONTAS</w:t>
+        <w:t xml:space="preserve">4.5 TRINTA E TRÊS PAUTAS PRONTAS</w:t>
       </w:r>
     </w:p>
     <w:p>
@@ -15386,6 +16892,107 @@
           <w:szCs w:val="21"/>
         </w:rPr>
         <w:t xml:space="preserve">(card + legenda fórmula 1)</w:t>
+      </w:r>
+    </w:p>
+    <w:p>
+      <w:pPr>
+        <w:pStyle w:val="ListParagraph"/>
+        <w:numPr>
+          <w:ilvl w:val="0"/>
+          <w:numId w:val="3"/>
+        </w:numPr>
+        <w:spacing w:after="60" w:line="290"/>
+      </w:pPr>
+      <w:r>
+        <w:rPr>
+          <w:rFonts w:ascii="Calibri" w:cs="Calibri" w:eastAsia="Calibri" w:hAnsi="Calibri"/>
+          <w:b/>
+          <w:bCs/>
+          <w:color w:val="1A1A1A"/>
+          <w:sz w:val="21"/>
+          <w:szCs w:val="21"/>
+        </w:rPr>
+        <w:t xml:space="preserve">2015: treze anos cuidando de uma casa antes de ela ser nossa</w:t>
+      </w:r>
+      <w:r>
+        <w:rPr>
+          <w:rFonts w:ascii="Calibri" w:cs="Calibri" w:eastAsia="Calibri" w:hAnsi="Calibri"/>
+          <w:color w:val="1A1A1A"/>
+          <w:sz w:val="21"/>
+          <w:szCs w:val="21"/>
+        </w:rPr>
+        <w:t xml:space="preserve"> — foto antiga + foto de hoje </w:t>
+      </w:r>
+      <w:r>
+        <w:rPr>
+          <w:rFonts w:ascii="Calibri" w:cs="Calibri" w:eastAsia="Calibri" w:hAnsi="Calibri"/>
+          <w:i/>
+          <w:iCs/>
+          <w:color w:val="1A1A1A"/>
+          <w:sz w:val="21"/>
+          <w:szCs w:val="21"/>
+        </w:rPr>
+        <w:t xml:space="preserve">(carrossel, fórmula 1)</w:t>
+      </w:r>
+    </w:p>
+    <w:p>
+      <w:pPr>
+        <w:pStyle w:val="ListParagraph"/>
+        <w:numPr>
+          <w:ilvl w:val="0"/>
+          <w:numId w:val="3"/>
+        </w:numPr>
+        <w:spacing w:after="60" w:line="290"/>
+      </w:pPr>
+      <w:r>
+        <w:rPr>
+          <w:rFonts w:ascii="Calibri" w:cs="Calibri" w:eastAsia="Calibri" w:hAnsi="Calibri"/>
+          <w:color w:val="1A1A1A"/>
+          <w:sz w:val="21"/>
+          <w:szCs w:val="21"/>
+        </w:rPr>
+        <w:t xml:space="preserve">As três suítes com varanda — a categoria mais escassa da casa </w:t>
+      </w:r>
+      <w:r>
+        <w:rPr>
+          <w:rFonts w:ascii="Calibri" w:cs="Calibri" w:eastAsia="Calibri" w:hAnsi="Calibri"/>
+          <w:i/>
+          <w:iCs/>
+          <w:color w:val="1A1A1A"/>
+          <w:sz w:val="21"/>
+          <w:szCs w:val="21"/>
+        </w:rPr>
+        <w:t xml:space="preserve">(foto ou Reels)</w:t>
+      </w:r>
+    </w:p>
+    <w:p>
+      <w:pPr>
+        <w:pStyle w:val="ListParagraph"/>
+        <w:numPr>
+          <w:ilvl w:val="0"/>
+          <w:numId w:val="3"/>
+        </w:numPr>
+        <w:spacing w:after="60" w:line="290"/>
+      </w:pPr>
+      <w:r>
+        <w:rPr>
+          <w:rFonts w:ascii="Calibri" w:cs="Calibri" w:eastAsia="Calibri" w:hAnsi="Calibri"/>
+          <w:color w:val="1A1A1A"/>
+          <w:sz w:val="21"/>
+          <w:szCs w:val="21"/>
+        </w:rPr>
+        <w:t xml:space="preserve">"Nove embaixo, nove em cima" — como a casa é dividida </w:t>
+      </w:r>
+      <w:r>
+        <w:rPr>
+          <w:rFonts w:ascii="Calibri" w:cs="Calibri" w:eastAsia="Calibri" w:hAnsi="Calibri"/>
+          <w:i/>
+          <w:iCs/>
+          <w:color w:val="1A1A1A"/>
+          <w:sz w:val="21"/>
+          <w:szCs w:val="21"/>
+        </w:rPr>
+        <w:t xml:space="preserve">(carrossel de suítes por categoria)</w:t>
       </w:r>
     </w:p>
     <w:p>
@@ -18481,6 +20088,122 @@
     </w:p>
     <w:p>
       <w:pPr>
+        <w:pStyle w:val="ListParagraph"/>
+        <w:numPr>
+          <w:ilvl w:val="0"/>
+          <w:numId w:val="2"/>
+        </w:numPr>
+        <w:spacing w:after="60" w:line="290"/>
+      </w:pPr>
+      <w:r>
+        <w:rPr>
+          <w:rFonts w:ascii="Calibri" w:cs="Calibri" w:eastAsia="Calibri" w:hAnsi="Calibri"/>
+          <w:color w:val="1A1A1A"/>
+          <w:sz w:val="21"/>
+          <w:szCs w:val="21"/>
+        </w:rPr>
+        <w:t xml:space="preserve">☐  </w:t>
+      </w:r>
+      <w:r>
+        <w:rPr>
+          <w:rFonts w:ascii="Calibri" w:cs="Calibri" w:eastAsia="Calibri" w:hAnsi="Calibri"/>
+          <w:b/>
+          <w:bCs/>
+          <w:color w:val="1A1A1A"/>
+          <w:sz w:val="21"/>
+          <w:szCs w:val="21"/>
+        </w:rPr>
+        <w:t xml:space="preserve">Analisar os posts de agosto/2026 (24 anos) e os perfis de referência</w:t>
+      </w:r>
+      <w:r>
+        <w:rPr>
+          <w:rFonts w:ascii="Calibri" w:cs="Calibri" w:eastAsia="Calibri" w:hAnsi="Calibri"/>
+          <w:color w:val="1A1A1A"/>
+          <w:sz w:val="21"/>
+          <w:szCs w:val="21"/>
+        </w:rPr>
+        <w:t xml:space="preserve"> — pendente por bloqueio de rede, ver nota abaixo</w:t>
+      </w:r>
+    </w:p>
+    <w:p>
+      <w:pPr>
+        <w:pBdr>
+          <w:left w:val="single" w:color="04B2D9" w:sz="18" w:space="14"/>
+        </w:pBdr>
+        <w:spacing w:after="200" w:before="160" w:line="320"/>
+        <w:ind w:left="460"/>
+      </w:pPr>
+      <w:r>
+        <w:rPr>
+          <w:rFonts w:ascii="Calibri" w:cs="Calibri" w:eastAsia="Calibri" w:hAnsi="Calibri"/>
+          <w:b/>
+          <w:bCs/>
+          <w:i w:val="false"/>
+          <w:iCs w:val="false"/>
+          <w:color w:val="0E3740"/>
+          <w:sz w:val="22"/>
+          <w:szCs w:val="22"/>
+        </w:rPr>
+        <w:t xml:space="preserve">Nota sobre análise de perfis:</w:t>
+      </w:r>
+      <w:r>
+        <w:rPr>
+          <w:rFonts w:ascii="Calibri" w:cs="Calibri" w:eastAsia="Calibri" w:hAnsi="Calibri"/>
+          <w:i w:val="false"/>
+          <w:iCs w:val="false"/>
+          <w:color w:val="2C3E44"/>
+          <w:sz w:val="22"/>
+          <w:szCs w:val="22"/>
+        </w:rPr>
+        <w:t xml:space="preserve"> o ambiente onde este documento foi produzido tem acesso negado a </w:t>
+      </w:r>
+      <w:r>
+        <w:rPr>
+          <w:rFonts w:ascii="Consolas" w:cs="Consolas" w:eastAsia="Consolas" w:hAnsi="Consolas"/>
+          <w:color w:val="0E3740"/>
+          <w:sz w:val="20"/>
+          <w:szCs w:val="20"/>
+        </w:rPr>
+        <w:t xml:space="preserve">instagram.com</w:t>
+      </w:r>
+      <w:r>
+        <w:rPr>
+          <w:rFonts w:ascii="Calibri" w:cs="Calibri" w:eastAsia="Calibri" w:hAnsi="Calibri"/>
+          <w:i w:val="false"/>
+          <w:iCs w:val="false"/>
+          <w:color w:val="2C3E44"/>
+          <w:sz w:val="22"/>
+          <w:szCs w:val="22"/>
+        </w:rPr>
+        <w:t xml:space="preserve"> pela política de rede. Os posts de agosto/2026 do @pousadacamburioficial e os perfis de referência (@pousadaliteraria e @ocanto.br) </w:t>
+      </w:r>
+      <w:r>
+        <w:rPr>
+          <w:rFonts w:ascii="Calibri" w:cs="Calibri" w:eastAsia="Calibri" w:hAnsi="Calibri"/>
+          <w:b/>
+          <w:bCs/>
+          <w:i w:val="false"/>
+          <w:iCs w:val="false"/>
+          <w:color w:val="0E3740"/>
+          <w:sz w:val="22"/>
+          <w:szCs w:val="22"/>
+        </w:rPr>
+        <w:t xml:space="preserve">não foram analisados diretamente</w:t>
+      </w:r>
+      <w:r>
+        <w:rPr>
+          <w:rFonts w:ascii="Calibri" w:cs="Calibri" w:eastAsia="Calibri" w:hAnsi="Calibri"/>
+          <w:i w:val="false"/>
+          <w:iCs w:val="false"/>
+          <w:color w:val="2C3E44"/>
+          <w:sz w:val="22"/>
+          <w:szCs w:val="22"/>
+        </w:rPr>
+        <w:t xml:space="preserve"> — nenhuma afirmação sobre o conteúdo deles consta neste documento. Para incorporá-los, é preciso liberar o domínio na configuração de rede do ambiente ou fornecer o material (capturas de tela, legendas em texto).</w:t>
+      </w:r>
+    </w:p>
+    <w:p>
+      <w:pPr>
         <w:pBdr>
           <w:bottom w:val="single" w:color="6AC4D9" w:sz="6" w:space="4"/>
         </w:pBdr>
@@ -18576,7 +20299,7 @@
           <w:sz w:val="21"/>
           <w:szCs w:val="21"/>
         </w:rPr>
-        <w:t xml:space="preserve">Quantas suítes de cada categoria (duplo / triplo / quádruplo)?</w:t>
+        <w:t xml:space="preserve">As suítes superiores têm vista? De quê — mar, mata, piscina?</w:t>
       </w:r>
     </w:p>
     <w:p>
@@ -18595,7 +20318,7 @@
           <w:sz w:val="21"/>
           <w:szCs w:val="21"/>
         </w:rPr>
-        <w:t xml:space="preserve">As suítes têm ar-condicionado, varanda, vista? Alguma categoria tem hidromassagem ou vista para o mar?</w:t>
+        <w:t xml:space="preserve">O que mais diferencia térreo de superior, além do andar?</w:t>
       </w:r>
     </w:p>
     <w:p>
@@ -18614,7 +20337,7 @@
           <w:sz w:val="21"/>
           <w:szCs w:val="21"/>
         </w:rPr>
-        <w:t xml:space="preserve">Metragem média das suítes?</w:t>
+        <w:t xml:space="preserve">Metragem média por categoria?</w:t>
       </w:r>
     </w:p>
     <w:p>
@@ -18706,7 +20429,7 @@
           <w:sz w:val="21"/>
           <w:szCs w:val="21"/>
         </w:rPr>
-        <w:t xml:space="preserve">O bar fica na pousada, na praia, ou ambos? O serviço na areia é atendido por quem?</w:t>
+        <w:t xml:space="preserve">O bar fica na pousada, na praia, ou ambos? Quem atende na areia?</w:t>
       </w:r>
     </w:p>
     <w:p>
@@ -18744,7 +20467,23 @@
           <w:sz w:val="21"/>
           <w:szCs w:val="21"/>
         </w:rPr>
-        <w:t xml:space="preserve">O serviço de praia é incluso na diária ou cobrado à parte?</w:t>
+        <w:t xml:space="preserve">Há estacionamento próprio? Quantas vagas?</w:t>
+      </w:r>
+    </w:p>
+    <w:p>
+      <w:pPr>
+        <w:spacing w:after="120" w:line="300"/>
+      </w:pPr>
+      <w:r>
+        <w:rPr>
+          <w:rFonts w:ascii="Calibri" w:cs="Calibri" w:eastAsia="Calibri" w:hAnsi="Calibri"/>
+          <w:b/>
+          <w:bCs/>
+          <w:color w:val="1A1A1A"/>
+          <w:sz w:val="21"/>
+          <w:szCs w:val="21"/>
+        </w:rPr>
+        <w:t xml:space="preserve">Marca</w:t>
       </w:r>
     </w:p>
     <w:p>
@@ -18763,7 +20502,86 @@
           <w:sz w:val="21"/>
           <w:szCs w:val="21"/>
         </w:rPr>
-        <w:t xml:space="preserve">Há estacionamento próprio? Quantas vagas?</w:t>
+        <w:t xml:space="preserve">Rodrigo fundou a pousada sozinho em 2002? Qual o papel da Adriana, e desde quando? </w:t>
+      </w:r>
+      <w:r>
+        <w:rPr>
+          <w:rFonts w:ascii="Calibri" w:cs="Calibri" w:eastAsia="Calibri" w:hAnsi="Calibri"/>
+          <w:i/>
+          <w:iCs/>
+          <w:color w:val="1A1A1A"/>
+          <w:sz w:val="21"/>
+          <w:szCs w:val="21"/>
+        </w:rPr>
+        <w:t xml:space="preserve">(Rodrigo e Adriana são citados nominalmente nas avaliações do TripAdvisor — são ativos de marca ainda não usados.)</w:t>
+      </w:r>
+    </w:p>
+    <w:p>
+      <w:pPr>
+        <w:pStyle w:val="ListParagraph"/>
+        <w:numPr>
+          <w:ilvl w:val="0"/>
+          <w:numId w:val="2"/>
+        </w:numPr>
+        <w:spacing w:after="60" w:line="290"/>
+      </w:pPr>
+      <w:r>
+        <w:rPr>
+          <w:rFonts w:ascii="Calibri" w:cs="Calibri" w:eastAsia="Calibri" w:hAnsi="Calibri"/>
+          <w:color w:val="1A1A1A"/>
+          <w:sz w:val="21"/>
+          <w:szCs w:val="21"/>
+        </w:rPr>
+        <w:t xml:space="preserve">O que Rodrigo fazia antes de 2002, e por que Camburi? </w:t>
+      </w:r>
+      <w:r>
+        <w:rPr>
+          <w:rFonts w:ascii="Calibri" w:cs="Calibri" w:eastAsia="Calibri" w:hAnsi="Calibri"/>
+          <w:i/>
+          <w:iCs/>
+          <w:color w:val="1A1A1A"/>
+          <w:sz w:val="21"/>
+          <w:szCs w:val="21"/>
+        </w:rPr>
+        <w:t xml:space="preserve">(É o "evento catalisador" da história de fundação — sem ele, a narrativa começa no meio.)</w:t>
+      </w:r>
+    </w:p>
+    <w:p>
+      <w:pPr>
+        <w:pStyle w:val="ListParagraph"/>
+        <w:numPr>
+          <w:ilvl w:val="0"/>
+          <w:numId w:val="2"/>
+        </w:numPr>
+        <w:spacing w:after="60" w:line="290"/>
+      </w:pPr>
+      <w:r>
+        <w:rPr>
+          <w:rFonts w:ascii="Calibri" w:cs="Calibri" w:eastAsia="Calibri" w:hAnsi="Calibri"/>
+          <w:color w:val="1A1A1A"/>
+          <w:sz w:val="21"/>
+          <w:szCs w:val="21"/>
+        </w:rPr>
+        <w:t xml:space="preserve">Existe registro fotográfico de 2002 a 2015? É o que viabiliza a pauta 31.</w:t>
+      </w:r>
+    </w:p>
+    <w:p>
+      <w:pPr>
+        <w:pStyle w:val="ListParagraph"/>
+        <w:numPr>
+          <w:ilvl w:val="0"/>
+          <w:numId w:val="2"/>
+        </w:numPr>
+        <w:spacing w:after="60" w:line="290"/>
+      </w:pPr>
+      <w:r>
+        <w:rPr>
+          <w:rFonts w:ascii="Calibri" w:cs="Calibri" w:eastAsia="Calibri" w:hAnsi="Calibri"/>
+          <w:color w:val="1A1A1A"/>
+          <w:sz w:val="21"/>
+          <w:szCs w:val="21"/>
+        </w:rPr>
+        <w:t xml:space="preserve">Por que "Camburi"? Existe história de origem do nome ou do peixe do logo?</w:t>
       </w:r>
     </w:p>
     <w:p>
@@ -18779,7 +20597,7 @@
           <w:sz w:val="21"/>
           <w:szCs w:val="21"/>
         </w:rPr>
-        <w:t xml:space="preserve">Marca</w:t>
+        <w:t xml:space="preserve">Operação de conteúdo</w:t>
       </w:r>
     </w:p>
     <w:p>
@@ -18798,7 +20616,7 @@
           <w:sz w:val="21"/>
           <w:szCs w:val="21"/>
         </w:rPr>
-        <w:t xml:space="preserve">Quem são as pessoas por trás da pousada, e qual o papel de cada um? (Rodrigo e Adriana aparecem nas avaliações — a história de fundação de 2002 ainda não está escrita.)</w:t>
+        <w:t xml:space="preserve">Quem posta hoje? Com que frequência?</w:t>
       </w:r>
     </w:p>
     <w:p>
@@ -18817,7 +20635,7 @@
           <w:sz w:val="21"/>
           <w:szCs w:val="21"/>
         </w:rPr>
-        <w:t xml:space="preserve">Há registro fotográfico antigo, de 2002 em diante? Isso é ouro para o território 5.</w:t>
+        <w:t xml:space="preserve">Existe banco de imagens organizado?</w:t>
       </w:r>
     </w:p>
     <w:p>
@@ -18836,7 +20654,7 @@
           <w:sz w:val="21"/>
           <w:szCs w:val="21"/>
         </w:rPr>
-        <w:t xml:space="preserve">Por que "Camburi"? Existe uma história de origem do nome, do peixe do logo?</w:t>
+        <w:t xml:space="preserve">O WhatsApp de reservas é qual, e quem responde?</w:t>
       </w:r>
     </w:p>
     <w:p>
@@ -18852,7 +20670,7 @@
           <w:sz w:val="21"/>
           <w:szCs w:val="21"/>
         </w:rPr>
-        <w:t xml:space="preserve">Operação de conteúdo</w:t>
+        <w:t xml:space="preserve">Pendente de leitura direta</w:t>
       </w:r>
     </w:p>
     <w:p>
@@ -18871,45 +20689,27 @@
           <w:sz w:val="21"/>
           <w:szCs w:val="21"/>
         </w:rPr>
-        <w:t xml:space="preserve">Quem posta hoje? Com que frequência?</w:t>
-      </w:r>
-    </w:p>
-    <w:p>
-      <w:pPr>
-        <w:pStyle w:val="ListParagraph"/>
-        <w:numPr>
-          <w:ilvl w:val="0"/>
-          <w:numId w:val="2"/>
-        </w:numPr>
-        <w:spacing w:after="60" w:line="290"/>
-      </w:pPr>
-      <w:r>
-        <w:rPr>
-          <w:rFonts w:ascii="Calibri" w:cs="Calibri" w:eastAsia="Calibri" w:hAnsi="Calibri"/>
-          <w:color w:val="1A1A1A"/>
-          <w:sz w:val="21"/>
-          <w:szCs w:val="21"/>
-        </w:rPr>
-        <w:t xml:space="preserve">Existe banco de imagens organizado?</w:t>
-      </w:r>
-    </w:p>
-    <w:p>
-      <w:pPr>
-        <w:pStyle w:val="ListParagraph"/>
-        <w:numPr>
-          <w:ilvl w:val="0"/>
-          <w:numId w:val="2"/>
-        </w:numPr>
-        <w:spacing w:after="60" w:line="290"/>
-      </w:pPr>
-      <w:r>
-        <w:rPr>
-          <w:rFonts w:ascii="Calibri" w:cs="Calibri" w:eastAsia="Calibri" w:hAnsi="Calibri"/>
-          <w:color w:val="1A1A1A"/>
-          <w:sz w:val="21"/>
-          <w:szCs w:val="21"/>
-        </w:rPr>
-        <w:t xml:space="preserve">O WhatsApp de reservas é qual, e quem responde?</w:t>
+        <w:t xml:space="preserve">Os posts de agosto/2026 sobre os 24 anos, no @pousadacamburioficial, </w:t>
+      </w:r>
+      <w:r>
+        <w:rPr>
+          <w:rFonts w:ascii="Calibri" w:cs="Calibri" w:eastAsia="Calibri" w:hAnsi="Calibri"/>
+          <w:b/>
+          <w:bCs/>
+          <w:color w:val="1A1A1A"/>
+          <w:sz w:val="21"/>
+          <w:szCs w:val="21"/>
+        </w:rPr>
+        <w:t xml:space="preserve">não puderam ser analisados</w:t>
+      </w:r>
+      <w:r>
+        <w:rPr>
+          <w:rFonts w:ascii="Calibri" w:cs="Calibri" w:eastAsia="Calibri" w:hAnsi="Calibri"/>
+          <w:color w:val="1A1A1A"/>
+          <w:sz w:val="21"/>
+          <w:szCs w:val="21"/>
+        </w:rPr>
+        <w:t xml:space="preserve"> — a política de rede deste ambiente bloqueia o acesso ao Instagram. Ver nota em 6.3.</w:t>
       </w:r>
     </w:p>
     <w:p>
@@ -19003,7 +20803,7 @@
         <w:sz w:val="16"/>
         <w:szCs w:val="16"/>
       </w:rPr>
-      <w:t xml:space="preserve">Pousada Camburi · v2.0 · setembro 2026 · </w:t>
+      <w:t xml:space="preserve">Pousada Camburi · v2.1 · setembro 2026 · </w:t>
     </w:r>
     <w:r>
       <w:rPr>

</xml_diff>